<commit_message>
Actualizacion y solucion login
</commit_message>
<xml_diff>
--- a/RUTAS.docx
+++ b/RUTAS.docx
@@ -139,8 +139,6 @@
       </w:r>
       <w:r>
         <w:br/>
-      </w:r>
-      <w:r>
         <w:t>Etapa</w:t>
       </w:r>
       <w:r>
@@ -242,6 +240,1259 @@
         <w:t>Logística</w:t>
       </w:r>
     </w:p>
+    <w:p/>
+    <w:p/>
+    <w:p/>
+    <w:p/>
+    <w:p>
+      <w:pPr>
+        <w:rPr>
+          <w:b/>
+          <w:bCs/>
+        </w:rPr>
+      </w:pPr>
+      <w:r>
+        <w:rPr>
+          <w:b/>
+          <w:bCs/>
+        </w:rPr>
+        <w:t>1. RUTA MAESTRA (CICLO DE VIDA COMPLETO)</w:t>
+      </w:r>
+    </w:p>
+    <w:p>
+      <w:r>
+        <w:t xml:space="preserve">[Inicio: Donación/MP] → [Recepción &amp; </w:t>
+      </w:r>
+      <w:proofErr w:type="spellStart"/>
+      <w:r>
+        <w:t>Triaje</w:t>
+      </w:r>
+      <w:proofErr w:type="spellEnd"/>
+      <w:r>
+        <w:t>] → [Procesamiento] → [Banco/Liofilización]</w:t>
+      </w:r>
+    </w:p>
+    <w:p>
+      <w:r>
+        <w:t>       ↓                          ↓                       ↓                           ↓</w:t>
+      </w:r>
+    </w:p>
+    <w:p>
+      <w:r>
+        <w:t>[FO-LC-17]             </w:t>
+      </w:r>
+      <w:proofErr w:type="gramStart"/>
+      <w:r>
+        <w:t>   [</w:t>
+      </w:r>
+      <w:proofErr w:type="gramEnd"/>
+      <w:r>
+        <w:t>FO-LC-18/19]         </w:t>
+      </w:r>
+      <w:proofErr w:type="gramStart"/>
+      <w:r>
+        <w:t>   [</w:t>
+      </w:r>
+      <w:proofErr w:type="gramEnd"/>
+      <w:r>
+        <w:t>FO-LC-20/42]            </w:t>
+      </w:r>
+      <w:proofErr w:type="gramStart"/>
+      <w:r>
+        <w:t>   [</w:t>
+      </w:r>
+      <w:proofErr w:type="gramEnd"/>
+      <w:r>
+        <w:t>FO-LC-22/43]</w:t>
+      </w:r>
+    </w:p>
+    <w:p>
+      <w:r>
+        <w:t>       ↓</w:t>
+      </w:r>
+    </w:p>
+    <w:p>
+      <w:r>
+        <w:t>[Control Calidad] → [Liberación Lote] → [Acondicionamiento] → [Almacén PT]</w:t>
+      </w:r>
+    </w:p>
+    <w:p>
+      <w:r>
+        <w:t>       ↓                        ↓                        ↓                        ↓</w:t>
+      </w:r>
+    </w:p>
+    <w:p>
+      <w:r>
+        <w:t>[FO-LC-41/44]        </w:t>
+      </w:r>
+      <w:proofErr w:type="gramStart"/>
+      <w:r>
+        <w:t>   [</w:t>
+      </w:r>
+      <w:proofErr w:type="gramEnd"/>
+      <w:r>
+        <w:t>FO-LC-32]           </w:t>
+      </w:r>
+      <w:proofErr w:type="gramStart"/>
+      <w:r>
+        <w:t>   [</w:t>
+      </w:r>
+      <w:proofErr w:type="gramEnd"/>
+      <w:r>
+        <w:t>FO-LC-31]             </w:t>
+      </w:r>
+      <w:proofErr w:type="gramStart"/>
+      <w:r>
+        <w:t>   [</w:t>
+      </w:r>
+      <w:proofErr w:type="gramEnd"/>
+      <w:r>
+        <w:t>FO-OP-20]</w:t>
+      </w:r>
+    </w:p>
+    <w:p>
+      <w:r>
+        <w:t>       ↓</w:t>
+      </w:r>
+    </w:p>
+    <w:p>
+      <w:r>
+        <w:t>[Venta/Pedido] → [Picking/Surtido] → [Logística/Entrega] → [Fin: Cliente]</w:t>
+      </w:r>
+    </w:p>
+    <w:p>
+      <w:pPr>
+        <w:rPr>
+          <w:lang w:val="en-US"/>
+        </w:rPr>
+      </w:pPr>
+      <w:r>
+        <w:t xml:space="preserve">       </w:t>
+      </w:r>
+      <w:r>
+        <w:rPr>
+          <w:lang w:val="en-US"/>
+        </w:rPr>
+        <w:t>↓                       ↓                        ↓</w:t>
+      </w:r>
+    </w:p>
+    <w:p>
+      <w:pPr>
+        <w:rPr>
+          <w:lang w:val="en-US"/>
+        </w:rPr>
+      </w:pPr>
+      <w:r>
+        <w:rPr>
+          <w:lang w:val="en-US"/>
+        </w:rPr>
+        <w:t>[FO-OP-15]            </w:t>
+      </w:r>
+      <w:proofErr w:type="gramStart"/>
+      <w:r>
+        <w:rPr>
+          <w:lang w:val="en-US"/>
+        </w:rPr>
+        <w:t>   [</w:t>
+      </w:r>
+      <w:proofErr w:type="gramEnd"/>
+      <w:r>
+        <w:rPr>
+          <w:lang w:val="en-US"/>
+        </w:rPr>
+        <w:t>FO-OP-16]           </w:t>
+      </w:r>
+      <w:proofErr w:type="gramStart"/>
+      <w:r>
+        <w:rPr>
+          <w:lang w:val="en-US"/>
+        </w:rPr>
+        <w:t>   [</w:t>
+      </w:r>
+      <w:proofErr w:type="gramEnd"/>
+      <w:r>
+        <w:rPr>
+          <w:lang w:val="en-US"/>
+        </w:rPr>
+        <w:t>FO-OP-17]</w:t>
+      </w:r>
+    </w:p>
+    <w:p>
+      <w:r>
+        <w:pict w14:anchorId="1F0E736F">
+          <v:rect id="_x0000_i1043" style="width:0;height:1.5pt" o:hralign="center" o:hrstd="t" o:hr="t" fillcolor="#a0a0a0" stroked="f"/>
+        </w:pict>
+      </w:r>
+    </w:p>
+    <w:p>
+      <w:pPr>
+        <w:rPr>
+          <w:b/>
+          <w:bCs/>
+        </w:rPr>
+      </w:pPr>
+      <w:r>
+        <w:rPr>
+          <w:b/>
+          <w:bCs/>
+        </w:rPr>
+        <w:t>2. RUTA DETALLADA: PRODUCCIÓN Y LIBERACIÓN</w:t>
+      </w:r>
+    </w:p>
+    <w:p>
+      <w:r>
+        <w:t>[Inicio: Recepción]</w:t>
+      </w:r>
+    </w:p>
+    <w:p>
+      <w:r>
+        <w:t>       ↓</w:t>
+      </w:r>
+    </w:p>
+    <w:p>
+      <w:r>
+        <w:t>[Registro Datos Clínicos] → [Generar ID Materia Prima] → [Evaluación Macro]</w:t>
+      </w:r>
+    </w:p>
+    <w:p>
+      <w:r>
+        <w:t>[FO-LC-17]                                              </w:t>
+      </w:r>
+      <w:proofErr w:type="gramStart"/>
+      <w:r>
+        <w:t>   [</w:t>
+      </w:r>
+      <w:proofErr w:type="gramEnd"/>
+      <w:r>
+        <w:t>FO-LC-18]</w:t>
+      </w:r>
+    </w:p>
+    <w:p>
+      <w:r>
+        <w:t>       ↓</w:t>
+      </w:r>
+    </w:p>
+    <w:p>
+      <w:r>
+        <w:t xml:space="preserve">   </w:t>
+      </w:r>
+      <w:r>
+        <w:rPr>
+          <w:b/>
+          <w:bCs/>
+        </w:rPr>
+        <w:t>¿Es Celular o Acelular?</w:t>
+      </w:r>
+    </w:p>
+    <w:p>
+      <w:r>
+        <w:lastRenderedPageBreak/>
+        <w:t>   ↙                                 ↘</w:t>
+      </w:r>
+    </w:p>
+    <w:p>
+      <w:r>
+        <w:t>[CELULAR]                       </w:t>
+      </w:r>
+      <w:proofErr w:type="gramStart"/>
+      <w:r>
+        <w:t>   [</w:t>
+      </w:r>
+      <w:proofErr w:type="gramEnd"/>
+      <w:r>
+        <w:t>ACELULAR]</w:t>
+      </w:r>
+    </w:p>
+    <w:p>
+      <w:r>
+        <w:t>[Digestión/Explante]            </w:t>
+      </w:r>
+      <w:proofErr w:type="gramStart"/>
+      <w:r>
+        <w:t>   [</w:t>
+      </w:r>
+      <w:proofErr w:type="gramEnd"/>
+      <w:r>
+        <w:t>Lavado/Liofilización]</w:t>
+      </w:r>
+    </w:p>
+    <w:p>
+      <w:r>
+        <w:t>[FO-LC-20]                      </w:t>
+      </w:r>
+      <w:proofErr w:type="gramStart"/>
+      <w:r>
+        <w:t>   [</w:t>
+      </w:r>
+      <w:proofErr w:type="gramEnd"/>
+      <w:r>
+        <w:t>FO-LC-42 / 43]</w:t>
+      </w:r>
+    </w:p>
+    <w:p>
+      <w:r>
+        <w:t>   ↓                                     ↓</w:t>
+      </w:r>
+    </w:p>
+    <w:p>
+      <w:r>
+        <w:t>[Cultivo &amp; Pases]               </w:t>
+      </w:r>
+      <w:proofErr w:type="gramStart"/>
+      <w:r>
+        <w:t>   [</w:t>
+      </w:r>
+      <w:proofErr w:type="gramEnd"/>
+      <w:r>
+        <w:t>Tamizado &amp; Dosificación]</w:t>
+      </w:r>
+    </w:p>
+    <w:p>
+      <w:r>
+        <w:t>[FO-LC-21]                      </w:t>
+      </w:r>
+      <w:proofErr w:type="gramStart"/>
+      <w:r>
+        <w:t>   [</w:t>
+      </w:r>
+      <w:proofErr w:type="gramEnd"/>
+      <w:r>
+        <w:t>FO-LC-42]</w:t>
+      </w:r>
+    </w:p>
+    <w:p>
+      <w:r>
+        <w:t>   ↓                                     ↓</w:t>
+      </w:r>
+    </w:p>
+    <w:p>
+      <w:r>
+        <w:t>[Crio-Preservación]             </w:t>
+      </w:r>
+      <w:proofErr w:type="gramStart"/>
+      <w:r>
+        <w:t>   [</w:t>
+      </w:r>
+      <w:proofErr w:type="gramEnd"/>
+      <w:r>
+        <w:t>Envío Esterilización]</w:t>
+      </w:r>
+    </w:p>
+    <w:p>
+      <w:r>
+        <w:t>[FO-LC-22 / 23]                 </w:t>
+      </w:r>
+      <w:proofErr w:type="gramStart"/>
+      <w:r>
+        <w:t>   [</w:t>
+      </w:r>
+      <w:proofErr w:type="gramEnd"/>
+      <w:r>
+        <w:t>FO-LC-45]</w:t>
+      </w:r>
+    </w:p>
+    <w:p>
+      <w:r>
+        <w:t>    ↘                                ↙</w:t>
+      </w:r>
+    </w:p>
+    <w:p>
+      <w:r>
+        <w:t>           [CONSOLIDACIÓN DE LOTE]</w:t>
+      </w:r>
+    </w:p>
+    <w:p>
+      <w:r>
+        <w:t>                      ↓</w:t>
+      </w:r>
+    </w:p>
+    <w:p>
+      <w:r>
+        <w:t>[Generación Lote PT] → [Asignar Caducidad] → [Código Barras Único]</w:t>
+      </w:r>
+    </w:p>
+    <w:p>
+      <w:r>
+        <w:t>[FO-LC-29 / 30]</w:t>
+      </w:r>
+    </w:p>
+    <w:p>
+      <w:r>
+        <w:t>                      ↓</w:t>
+      </w:r>
+    </w:p>
+    <w:p>
+      <w:r>
+        <w:t>[Pruebas Analíticas] → [Revisión Documental] → [DICTAMEN FINAL]</w:t>
+      </w:r>
+    </w:p>
+    <w:p>
+      <w:r>
+        <w:t>[FO-LC-41/44]       </w:t>
+      </w:r>
+      <w:proofErr w:type="gramStart"/>
+      <w:r>
+        <w:t>   [</w:t>
+      </w:r>
+      <w:proofErr w:type="gramEnd"/>
+      <w:r>
+        <w:t>FO-LC-16 Resumen]      </w:t>
+      </w:r>
+      <w:proofErr w:type="gramStart"/>
+      <w:r>
+        <w:t>   [</w:t>
+      </w:r>
+      <w:proofErr w:type="gramEnd"/>
+      <w:r>
+        <w:t>FO-LC-32]</w:t>
+      </w:r>
+    </w:p>
+    <w:p>
+      <w:r>
+        <w:pict w14:anchorId="086F2831">
+          <v:rect id="_x0000_i1044" style="width:0;height:1.5pt" o:hralign="center" o:hrstd="t" o:hr="t" fillcolor="#a0a0a0" stroked="f"/>
+        </w:pict>
+      </w:r>
+    </w:p>
+    <w:p>
+      <w:pPr>
+        <w:rPr>
+          <w:b/>
+          <w:bCs/>
+        </w:rPr>
+      </w:pPr>
+      <w:r>
+        <w:rPr>
+          <w:b/>
+          <w:bCs/>
+        </w:rPr>
+        <w:t>3. RUTA DETALLADA: FLUJO COMERCIAL Y LOGÍSTICO</w:t>
+      </w:r>
+    </w:p>
+    <w:p>
+      <w:r>
+        <w:t>[Solicitud Cliente]</w:t>
+      </w:r>
+    </w:p>
+    <w:p>
+      <w:r>
+        <w:t>       ↓</w:t>
+      </w:r>
+    </w:p>
+    <w:p>
+      <w:r>
+        <w:t>[Pedido Maestro] → [Validar Stock] → [Autorización Venta]</w:t>
+      </w:r>
+    </w:p>
+    <w:p>
+      <w:r>
+        <w:t>[FO-OP-15]      </w:t>
+      </w:r>
+      <w:proofErr w:type="gramStart"/>
+      <w:r>
+        <w:t>   [</w:t>
+      </w:r>
+      <w:proofErr w:type="gramEnd"/>
+      <w:r>
+        <w:t>FO-LC-24]         </w:t>
+      </w:r>
+      <w:proofErr w:type="gramStart"/>
+      <w:r>
+        <w:t>   (</w:t>
+      </w:r>
+      <w:proofErr w:type="gramEnd"/>
+      <w:r>
+        <w:t>Gerencia)</w:t>
+      </w:r>
+    </w:p>
+    <w:p>
+      <w:r>
+        <w:t>       ↓</w:t>
+      </w:r>
+    </w:p>
+    <w:p>
+      <w:r>
+        <w:t>[Orden Surtido] → [Picking Almacén] → [Validación Cadena Frío]</w:t>
+      </w:r>
+    </w:p>
+    <w:p>
+      <w:r>
+        <w:t>[FO-OP-16]      </w:t>
+      </w:r>
+      <w:proofErr w:type="gramStart"/>
+      <w:r>
+        <w:t>   (</w:t>
+      </w:r>
+      <w:proofErr w:type="gramEnd"/>
+      <w:r>
+        <w:t>Ubicación/</w:t>
+      </w:r>
+      <w:proofErr w:type="gramStart"/>
+      <w:r>
+        <w:t>Lote)   </w:t>
+      </w:r>
+      <w:proofErr w:type="gramEnd"/>
+      <w:r>
+        <w:t>  (Geles/Hielera)</w:t>
+      </w:r>
+    </w:p>
+    <w:p>
+      <w:r>
+        <w:t>       ↓</w:t>
+      </w:r>
+    </w:p>
+    <w:p>
+      <w:r>
+        <w:t>[Empaque Final] → [Liberación Salida] → [Generar Guía/Ruta]</w:t>
+      </w:r>
+    </w:p>
+    <w:p>
+      <w:r>
+        <w:lastRenderedPageBreak/>
+        <w:t>[FO-OP-16]      </w:t>
+      </w:r>
+      <w:proofErr w:type="gramStart"/>
+      <w:r>
+        <w:t>   [</w:t>
+      </w:r>
+      <w:proofErr w:type="gramEnd"/>
+      <w:r>
+        <w:t>FO-OP-20]</w:t>
+      </w:r>
+    </w:p>
+    <w:p>
+      <w:r>
+        <w:t>       ↓</w:t>
+      </w:r>
+    </w:p>
+    <w:p>
+      <w:r>
+        <w:t>[Entrega Física] → [Firma de Recibido] → [Archivo Digital]</w:t>
+      </w:r>
+    </w:p>
+    <w:p>
+      <w:r>
+        <w:t>[FO-OP-17]      </w:t>
+      </w:r>
+      <w:proofErr w:type="gramStart"/>
+      <w:r>
+        <w:t>   (Cliente)   </w:t>
+      </w:r>
+      <w:proofErr w:type="gramEnd"/>
+      <w:r>
+        <w:t>         </w:t>
+      </w:r>
+      <w:proofErr w:type="gramStart"/>
+      <w:r>
+        <w:t>   (</w:t>
+      </w:r>
+      <w:proofErr w:type="gramEnd"/>
+      <w:r>
+        <w:t>Sistema V1)</w:t>
+      </w:r>
+    </w:p>
+    <w:p>
+      <w:r>
+        <w:pict w14:anchorId="2B65A27D">
+          <v:rect id="_x0000_i1045" style="width:0;height:1.5pt" o:hralign="center" o:hrstd="t" o:hr="t" fillcolor="#a0a0a0" stroked="f"/>
+        </w:pict>
+      </w:r>
+    </w:p>
+    <w:p>
+      <w:pPr>
+        <w:rPr>
+          <w:b/>
+          <w:bCs/>
+        </w:rPr>
+      </w:pPr>
+      <w:r>
+        <w:rPr>
+          <w:b/>
+          <w:bCs/>
+        </w:rPr>
+        <w:t>TABLA DE TRAZABILIDAD (RESPONSABILIDADES)</w:t>
+      </w:r>
+    </w:p>
+    <w:tbl>
+      <w:tblPr>
+        <w:tblW w:w="0" w:type="auto"/>
+        <w:tblCellSpacing w:w="15" w:type="dxa"/>
+        <w:tblCellMar>
+          <w:top w:w="15" w:type="dxa"/>
+          <w:left w:w="15" w:type="dxa"/>
+          <w:bottom w:w="15" w:type="dxa"/>
+          <w:right w:w="15" w:type="dxa"/>
+        </w:tblCellMar>
+        <w:tblLook w:val="04A0" w:firstRow="1" w:lastRow="0" w:firstColumn="1" w:lastColumn="0" w:noHBand="0" w:noVBand="1"/>
+      </w:tblPr>
+      <w:tblGrid>
+        <w:gridCol w:w="922"/>
+        <w:gridCol w:w="3046"/>
+        <w:gridCol w:w="2698"/>
+        <w:gridCol w:w="2156"/>
+      </w:tblGrid>
+      <w:tr>
+        <w:trPr>
+          <w:tblHeader/>
+          <w:tblCellSpacing w:w="15" w:type="dxa"/>
+        </w:trPr>
+        <w:tc>
+          <w:tcPr>
+            <w:tcW w:w="0" w:type="auto"/>
+            <w:tcBorders>
+              <w:top w:val="single" w:sz="6" w:space="0" w:color="auto"/>
+              <w:left w:val="single" w:sz="6" w:space="0" w:color="auto"/>
+              <w:bottom w:val="single" w:sz="6" w:space="0" w:color="auto"/>
+              <w:right w:val="single" w:sz="6" w:space="0" w:color="auto"/>
+            </w:tcBorders>
+            <w:vAlign w:val="center"/>
+            <w:hideMark/>
+          </w:tcPr>
+          <w:p>
+            <w:r>
+              <w:rPr>
+                <w:b/>
+                <w:bCs/>
+              </w:rPr>
+              <w:t>Etapa</w:t>
+            </w:r>
+          </w:p>
+        </w:tc>
+        <w:tc>
+          <w:tcPr>
+            <w:tcW w:w="0" w:type="auto"/>
+            <w:tcBorders>
+              <w:top w:val="single" w:sz="6" w:space="0" w:color="auto"/>
+              <w:left w:val="single" w:sz="6" w:space="0" w:color="auto"/>
+              <w:bottom w:val="single" w:sz="6" w:space="0" w:color="auto"/>
+              <w:right w:val="single" w:sz="6" w:space="0" w:color="auto"/>
+            </w:tcBorders>
+            <w:vAlign w:val="center"/>
+            <w:hideMark/>
+          </w:tcPr>
+          <w:p>
+            <w:r>
+              <w:rPr>
+                <w:b/>
+                <w:bCs/>
+              </w:rPr>
+              <w:t>Qué se Traza</w:t>
+            </w:r>
+          </w:p>
+        </w:tc>
+        <w:tc>
+          <w:tcPr>
+            <w:tcW w:w="0" w:type="auto"/>
+            <w:tcBorders>
+              <w:top w:val="single" w:sz="6" w:space="0" w:color="auto"/>
+              <w:left w:val="single" w:sz="6" w:space="0" w:color="auto"/>
+              <w:bottom w:val="single" w:sz="6" w:space="0" w:color="auto"/>
+              <w:right w:val="single" w:sz="6" w:space="0" w:color="auto"/>
+            </w:tcBorders>
+            <w:vAlign w:val="center"/>
+            <w:hideMark/>
+          </w:tcPr>
+          <w:p>
+            <w:r>
+              <w:rPr>
+                <w:b/>
+                <w:bCs/>
+              </w:rPr>
+              <w:t>Cómo se Traza (Documento)</w:t>
+            </w:r>
+          </w:p>
+        </w:tc>
+        <w:tc>
+          <w:tcPr>
+            <w:tcW w:w="0" w:type="auto"/>
+            <w:tcBorders>
+              <w:top w:val="single" w:sz="6" w:space="0" w:color="auto"/>
+              <w:left w:val="single" w:sz="6" w:space="0" w:color="auto"/>
+              <w:bottom w:val="single" w:sz="6" w:space="0" w:color="auto"/>
+              <w:right w:val="single" w:sz="6" w:space="0" w:color="auto"/>
+            </w:tcBorders>
+            <w:vAlign w:val="center"/>
+            <w:hideMark/>
+          </w:tcPr>
+          <w:p>
+            <w:r>
+              <w:rPr>
+                <w:b/>
+                <w:bCs/>
+              </w:rPr>
+              <w:t>Responsable</w:t>
+            </w:r>
+          </w:p>
+        </w:tc>
+      </w:tr>
+      <w:tr>
+        <w:trPr>
+          <w:tblCellSpacing w:w="15" w:type="dxa"/>
+        </w:trPr>
+        <w:tc>
+          <w:tcPr>
+            <w:tcW w:w="0" w:type="auto"/>
+            <w:tcBorders>
+              <w:top w:val="single" w:sz="6" w:space="0" w:color="auto"/>
+              <w:left w:val="single" w:sz="6" w:space="0" w:color="auto"/>
+              <w:bottom w:val="single" w:sz="6" w:space="0" w:color="auto"/>
+              <w:right w:val="single" w:sz="6" w:space="0" w:color="auto"/>
+            </w:tcBorders>
+            <w:vAlign w:val="center"/>
+            <w:hideMark/>
+          </w:tcPr>
+          <w:p>
+            <w:r>
+              <w:rPr>
+                <w:b/>
+                <w:bCs/>
+              </w:rPr>
+              <w:t>Ingreso</w:t>
+            </w:r>
+          </w:p>
+        </w:tc>
+        <w:tc>
+          <w:tcPr>
+            <w:tcW w:w="0" w:type="auto"/>
+            <w:tcBorders>
+              <w:top w:val="single" w:sz="6" w:space="0" w:color="auto"/>
+              <w:left w:val="single" w:sz="6" w:space="0" w:color="auto"/>
+              <w:bottom w:val="single" w:sz="6" w:space="0" w:color="auto"/>
+              <w:right w:val="single" w:sz="6" w:space="0" w:color="auto"/>
+            </w:tcBorders>
+            <w:vAlign w:val="center"/>
+            <w:hideMark/>
+          </w:tcPr>
+          <w:p>
+            <w:r>
+              <w:t>Donante, Tejido, Sangre</w:t>
+            </w:r>
+          </w:p>
+        </w:tc>
+        <w:tc>
+          <w:tcPr>
+            <w:tcW w:w="0" w:type="auto"/>
+            <w:tcBorders>
+              <w:top w:val="single" w:sz="6" w:space="0" w:color="auto"/>
+              <w:left w:val="single" w:sz="6" w:space="0" w:color="auto"/>
+              <w:bottom w:val="single" w:sz="6" w:space="0" w:color="auto"/>
+              <w:right w:val="single" w:sz="6" w:space="0" w:color="auto"/>
+            </w:tcBorders>
+            <w:vAlign w:val="center"/>
+            <w:hideMark/>
+          </w:tcPr>
+          <w:p>
+            <w:r>
+              <w:t>FO-LC-17, FO-LC-18</w:t>
+            </w:r>
+          </w:p>
+        </w:tc>
+        <w:tc>
+          <w:tcPr>
+            <w:tcW w:w="0" w:type="auto"/>
+            <w:tcBorders>
+              <w:top w:val="single" w:sz="6" w:space="0" w:color="auto"/>
+              <w:left w:val="single" w:sz="6" w:space="0" w:color="auto"/>
+              <w:bottom w:val="single" w:sz="6" w:space="0" w:color="auto"/>
+              <w:right w:val="single" w:sz="6" w:space="0" w:color="auto"/>
+            </w:tcBorders>
+            <w:vAlign w:val="center"/>
+            <w:hideMark/>
+          </w:tcPr>
+          <w:p>
+            <w:r>
+              <w:t>Recepción / Calidad</w:t>
+            </w:r>
+          </w:p>
+        </w:tc>
+      </w:tr>
+      <w:tr>
+        <w:trPr>
+          <w:tblCellSpacing w:w="15" w:type="dxa"/>
+        </w:trPr>
+        <w:tc>
+          <w:tcPr>
+            <w:tcW w:w="0" w:type="auto"/>
+            <w:tcBorders>
+              <w:top w:val="single" w:sz="6" w:space="0" w:color="auto"/>
+              <w:left w:val="single" w:sz="6" w:space="0" w:color="auto"/>
+              <w:bottom w:val="single" w:sz="6" w:space="0" w:color="auto"/>
+              <w:right w:val="single" w:sz="6" w:space="0" w:color="auto"/>
+            </w:tcBorders>
+            <w:vAlign w:val="center"/>
+            <w:hideMark/>
+          </w:tcPr>
+          <w:p>
+            <w:r>
+              <w:rPr>
+                <w:b/>
+                <w:bCs/>
+              </w:rPr>
+              <w:t>Proceso</w:t>
+            </w:r>
+          </w:p>
+        </w:tc>
+        <w:tc>
+          <w:tcPr>
+            <w:tcW w:w="0" w:type="auto"/>
+            <w:tcBorders>
+              <w:top w:val="single" w:sz="6" w:space="0" w:color="auto"/>
+              <w:left w:val="single" w:sz="6" w:space="0" w:color="auto"/>
+              <w:bottom w:val="single" w:sz="6" w:space="0" w:color="auto"/>
+              <w:right w:val="single" w:sz="6" w:space="0" w:color="auto"/>
+            </w:tcBorders>
+            <w:vAlign w:val="center"/>
+            <w:hideMark/>
+          </w:tcPr>
+          <w:p>
+            <w:r>
+              <w:t>Línea Celular, Pases, Medios</w:t>
+            </w:r>
+          </w:p>
+        </w:tc>
+        <w:tc>
+          <w:tcPr>
+            <w:tcW w:w="0" w:type="auto"/>
+            <w:tcBorders>
+              <w:top w:val="single" w:sz="6" w:space="0" w:color="auto"/>
+              <w:left w:val="single" w:sz="6" w:space="0" w:color="auto"/>
+              <w:bottom w:val="single" w:sz="6" w:space="0" w:color="auto"/>
+              <w:right w:val="single" w:sz="6" w:space="0" w:color="auto"/>
+            </w:tcBorders>
+            <w:vAlign w:val="center"/>
+            <w:hideMark/>
+          </w:tcPr>
+          <w:p>
+            <w:r>
+              <w:t>FO-LC-20, FO-LC-21, FO-LC-40</w:t>
+            </w:r>
+          </w:p>
+        </w:tc>
+        <w:tc>
+          <w:tcPr>
+            <w:tcW w:w="0" w:type="auto"/>
+            <w:tcBorders>
+              <w:top w:val="single" w:sz="6" w:space="0" w:color="auto"/>
+              <w:left w:val="single" w:sz="6" w:space="0" w:color="auto"/>
+              <w:bottom w:val="single" w:sz="6" w:space="0" w:color="auto"/>
+              <w:right w:val="single" w:sz="6" w:space="0" w:color="auto"/>
+            </w:tcBorders>
+            <w:vAlign w:val="center"/>
+            <w:hideMark/>
+          </w:tcPr>
+          <w:p>
+            <w:r>
+              <w:t>Producción / Banco</w:t>
+            </w:r>
+          </w:p>
+        </w:tc>
+      </w:tr>
+      <w:tr>
+        <w:trPr>
+          <w:tblCellSpacing w:w="15" w:type="dxa"/>
+        </w:trPr>
+        <w:tc>
+          <w:tcPr>
+            <w:tcW w:w="0" w:type="auto"/>
+            <w:tcBorders>
+              <w:top w:val="single" w:sz="6" w:space="0" w:color="auto"/>
+              <w:left w:val="single" w:sz="6" w:space="0" w:color="auto"/>
+              <w:bottom w:val="single" w:sz="6" w:space="0" w:color="auto"/>
+              <w:right w:val="single" w:sz="6" w:space="0" w:color="auto"/>
+            </w:tcBorders>
+            <w:vAlign w:val="center"/>
+            <w:hideMark/>
+          </w:tcPr>
+          <w:p>
+            <w:r>
+              <w:rPr>
+                <w:b/>
+                <w:bCs/>
+              </w:rPr>
+              <w:t>Banco</w:t>
+            </w:r>
+          </w:p>
+        </w:tc>
+        <w:tc>
+          <w:tcPr>
+            <w:tcW w:w="0" w:type="auto"/>
+            <w:tcBorders>
+              <w:top w:val="single" w:sz="6" w:space="0" w:color="auto"/>
+              <w:left w:val="single" w:sz="6" w:space="0" w:color="auto"/>
+              <w:bottom w:val="single" w:sz="6" w:space="0" w:color="auto"/>
+              <w:right w:val="single" w:sz="6" w:space="0" w:color="auto"/>
+            </w:tcBorders>
+            <w:vAlign w:val="center"/>
+            <w:hideMark/>
+          </w:tcPr>
+          <w:p>
+            <w:r>
+              <w:t>Ubicación (Caja/Tanque), Vial</w:t>
+            </w:r>
+          </w:p>
+        </w:tc>
+        <w:tc>
+          <w:tcPr>
+            <w:tcW w:w="0" w:type="auto"/>
+            <w:tcBorders>
+              <w:top w:val="single" w:sz="6" w:space="0" w:color="auto"/>
+              <w:left w:val="single" w:sz="6" w:space="0" w:color="auto"/>
+              <w:bottom w:val="single" w:sz="6" w:space="0" w:color="auto"/>
+              <w:right w:val="single" w:sz="6" w:space="0" w:color="auto"/>
+            </w:tcBorders>
+            <w:vAlign w:val="center"/>
+            <w:hideMark/>
+          </w:tcPr>
+          <w:p>
+            <w:r>
+              <w:t>FO-LC-22, FO-LC-23</w:t>
+            </w:r>
+          </w:p>
+        </w:tc>
+        <w:tc>
+          <w:tcPr>
+            <w:tcW w:w="0" w:type="auto"/>
+            <w:tcBorders>
+              <w:top w:val="single" w:sz="6" w:space="0" w:color="auto"/>
+              <w:left w:val="single" w:sz="6" w:space="0" w:color="auto"/>
+              <w:bottom w:val="single" w:sz="6" w:space="0" w:color="auto"/>
+              <w:right w:val="single" w:sz="6" w:space="0" w:color="auto"/>
+            </w:tcBorders>
+            <w:vAlign w:val="center"/>
+            <w:hideMark/>
+          </w:tcPr>
+          <w:p>
+            <w:r>
+              <w:t>Coordinador Banco</w:t>
+            </w:r>
+          </w:p>
+        </w:tc>
+      </w:tr>
+      <w:tr>
+        <w:trPr>
+          <w:tblCellSpacing w:w="15" w:type="dxa"/>
+        </w:trPr>
+        <w:tc>
+          <w:tcPr>
+            <w:tcW w:w="0" w:type="auto"/>
+            <w:tcBorders>
+              <w:top w:val="single" w:sz="6" w:space="0" w:color="auto"/>
+              <w:left w:val="single" w:sz="6" w:space="0" w:color="auto"/>
+              <w:bottom w:val="single" w:sz="6" w:space="0" w:color="auto"/>
+              <w:right w:val="single" w:sz="6" w:space="0" w:color="auto"/>
+            </w:tcBorders>
+            <w:vAlign w:val="center"/>
+            <w:hideMark/>
+          </w:tcPr>
+          <w:p>
+            <w:r>
+              <w:rPr>
+                <w:b/>
+                <w:bCs/>
+              </w:rPr>
+              <w:t>Calidad</w:t>
+            </w:r>
+          </w:p>
+        </w:tc>
+        <w:tc>
+          <w:tcPr>
+            <w:tcW w:w="0" w:type="auto"/>
+            <w:tcBorders>
+              <w:top w:val="single" w:sz="6" w:space="0" w:color="auto"/>
+              <w:left w:val="single" w:sz="6" w:space="0" w:color="auto"/>
+              <w:bottom w:val="single" w:sz="6" w:space="0" w:color="auto"/>
+              <w:right w:val="single" w:sz="6" w:space="0" w:color="auto"/>
+            </w:tcBorders>
+            <w:vAlign w:val="center"/>
+            <w:hideMark/>
+          </w:tcPr>
+          <w:p>
+            <w:r>
+              <w:t>Esterilidad, Endotoxinas, Lote</w:t>
+            </w:r>
+          </w:p>
+        </w:tc>
+        <w:tc>
+          <w:tcPr>
+            <w:tcW w:w="0" w:type="auto"/>
+            <w:tcBorders>
+              <w:top w:val="single" w:sz="6" w:space="0" w:color="auto"/>
+              <w:left w:val="single" w:sz="6" w:space="0" w:color="auto"/>
+              <w:bottom w:val="single" w:sz="6" w:space="0" w:color="auto"/>
+              <w:right w:val="single" w:sz="6" w:space="0" w:color="auto"/>
+            </w:tcBorders>
+            <w:vAlign w:val="center"/>
+            <w:hideMark/>
+          </w:tcPr>
+          <w:p>
+            <w:r>
+              <w:t>FO-LC-41, FO-LC-44, FO-LC-32</w:t>
+            </w:r>
+          </w:p>
+        </w:tc>
+        <w:tc>
+          <w:tcPr>
+            <w:tcW w:w="0" w:type="auto"/>
+            <w:tcBorders>
+              <w:top w:val="single" w:sz="6" w:space="0" w:color="auto"/>
+              <w:left w:val="single" w:sz="6" w:space="0" w:color="auto"/>
+              <w:bottom w:val="single" w:sz="6" w:space="0" w:color="auto"/>
+              <w:right w:val="single" w:sz="6" w:space="0" w:color="auto"/>
+            </w:tcBorders>
+            <w:vAlign w:val="center"/>
+            <w:hideMark/>
+          </w:tcPr>
+          <w:p>
+            <w:r>
+              <w:t>Aseguramiento Calidad</w:t>
+            </w:r>
+          </w:p>
+        </w:tc>
+      </w:tr>
+      <w:tr>
+        <w:trPr>
+          <w:tblCellSpacing w:w="15" w:type="dxa"/>
+        </w:trPr>
+        <w:tc>
+          <w:tcPr>
+            <w:tcW w:w="0" w:type="auto"/>
+            <w:tcBorders>
+              <w:top w:val="single" w:sz="6" w:space="0" w:color="auto"/>
+              <w:left w:val="single" w:sz="6" w:space="0" w:color="auto"/>
+              <w:bottom w:val="single" w:sz="6" w:space="0" w:color="auto"/>
+              <w:right w:val="single" w:sz="6" w:space="0" w:color="auto"/>
+            </w:tcBorders>
+            <w:vAlign w:val="center"/>
+            <w:hideMark/>
+          </w:tcPr>
+          <w:p>
+            <w:r>
+              <w:rPr>
+                <w:b/>
+                <w:bCs/>
+              </w:rPr>
+              <w:t>Lote PT</w:t>
+            </w:r>
+          </w:p>
+        </w:tc>
+        <w:tc>
+          <w:tcPr>
+            <w:tcW w:w="0" w:type="auto"/>
+            <w:tcBorders>
+              <w:top w:val="single" w:sz="6" w:space="0" w:color="auto"/>
+              <w:left w:val="single" w:sz="6" w:space="0" w:color="auto"/>
+              <w:bottom w:val="single" w:sz="6" w:space="0" w:color="auto"/>
+              <w:right w:val="single" w:sz="6" w:space="0" w:color="auto"/>
+            </w:tcBorders>
+            <w:vAlign w:val="center"/>
+            <w:hideMark/>
+          </w:tcPr>
+          <w:p>
+            <w:r>
+              <w:t>Cantidad, Presentación, Caducidad</w:t>
+            </w:r>
+          </w:p>
+        </w:tc>
+        <w:tc>
+          <w:tcPr>
+            <w:tcW w:w="0" w:type="auto"/>
+            <w:tcBorders>
+              <w:top w:val="single" w:sz="6" w:space="0" w:color="auto"/>
+              <w:left w:val="single" w:sz="6" w:space="0" w:color="auto"/>
+              <w:bottom w:val="single" w:sz="6" w:space="0" w:color="auto"/>
+              <w:right w:val="single" w:sz="6" w:space="0" w:color="auto"/>
+            </w:tcBorders>
+            <w:vAlign w:val="center"/>
+            <w:hideMark/>
+          </w:tcPr>
+          <w:p>
+            <w:r>
+              <w:t>FO-LC-29, FO-LC-30, FO-LC-31</w:t>
+            </w:r>
+          </w:p>
+        </w:tc>
+        <w:tc>
+          <w:tcPr>
+            <w:tcW w:w="0" w:type="auto"/>
+            <w:tcBorders>
+              <w:top w:val="single" w:sz="6" w:space="0" w:color="auto"/>
+              <w:left w:val="single" w:sz="6" w:space="0" w:color="auto"/>
+              <w:bottom w:val="single" w:sz="6" w:space="0" w:color="auto"/>
+              <w:right w:val="single" w:sz="6" w:space="0" w:color="auto"/>
+            </w:tcBorders>
+            <w:vAlign w:val="center"/>
+            <w:hideMark/>
+          </w:tcPr>
+          <w:p>
+            <w:r>
+              <w:t>Producción / Calidad</w:t>
+            </w:r>
+          </w:p>
+        </w:tc>
+      </w:tr>
+      <w:tr>
+        <w:trPr>
+          <w:tblCellSpacing w:w="15" w:type="dxa"/>
+        </w:trPr>
+        <w:tc>
+          <w:tcPr>
+            <w:tcW w:w="0" w:type="auto"/>
+            <w:tcBorders>
+              <w:top w:val="single" w:sz="6" w:space="0" w:color="auto"/>
+              <w:left w:val="single" w:sz="6" w:space="0" w:color="auto"/>
+              <w:bottom w:val="single" w:sz="6" w:space="0" w:color="auto"/>
+              <w:right w:val="single" w:sz="6" w:space="0" w:color="auto"/>
+            </w:tcBorders>
+            <w:vAlign w:val="center"/>
+            <w:hideMark/>
+          </w:tcPr>
+          <w:p>
+            <w:r>
+              <w:rPr>
+                <w:b/>
+                <w:bCs/>
+              </w:rPr>
+              <w:t>Venta</w:t>
+            </w:r>
+          </w:p>
+        </w:tc>
+        <w:tc>
+          <w:tcPr>
+            <w:tcW w:w="0" w:type="auto"/>
+            <w:tcBorders>
+              <w:top w:val="single" w:sz="6" w:space="0" w:color="auto"/>
+              <w:left w:val="single" w:sz="6" w:space="0" w:color="auto"/>
+              <w:bottom w:val="single" w:sz="6" w:space="0" w:color="auto"/>
+              <w:right w:val="single" w:sz="6" w:space="0" w:color="auto"/>
+            </w:tcBorders>
+            <w:vAlign w:val="center"/>
+            <w:hideMark/>
+          </w:tcPr>
+          <w:p>
+            <w:r>
+              <w:t>Cliente, Pedido, Lote Asignado</w:t>
+            </w:r>
+          </w:p>
+        </w:tc>
+        <w:tc>
+          <w:tcPr>
+            <w:tcW w:w="0" w:type="auto"/>
+            <w:tcBorders>
+              <w:top w:val="single" w:sz="6" w:space="0" w:color="auto"/>
+              <w:left w:val="single" w:sz="6" w:space="0" w:color="auto"/>
+              <w:bottom w:val="single" w:sz="6" w:space="0" w:color="auto"/>
+              <w:right w:val="single" w:sz="6" w:space="0" w:color="auto"/>
+            </w:tcBorders>
+            <w:vAlign w:val="center"/>
+            <w:hideMark/>
+          </w:tcPr>
+          <w:p>
+            <w:r>
+              <w:t>FO-OP-15, FO-OP-16</w:t>
+            </w:r>
+          </w:p>
+        </w:tc>
+        <w:tc>
+          <w:tcPr>
+            <w:tcW w:w="0" w:type="auto"/>
+            <w:tcBorders>
+              <w:top w:val="single" w:sz="6" w:space="0" w:color="auto"/>
+              <w:left w:val="single" w:sz="6" w:space="0" w:color="auto"/>
+              <w:bottom w:val="single" w:sz="6" w:space="0" w:color="auto"/>
+              <w:right w:val="single" w:sz="6" w:space="0" w:color="auto"/>
+            </w:tcBorders>
+            <w:vAlign w:val="center"/>
+            <w:hideMark/>
+          </w:tcPr>
+          <w:p>
+            <w:r>
+              <w:t>Ventas / Almacén</w:t>
+            </w:r>
+          </w:p>
+        </w:tc>
+      </w:tr>
+      <w:tr>
+        <w:trPr>
+          <w:tblCellSpacing w:w="15" w:type="dxa"/>
+        </w:trPr>
+        <w:tc>
+          <w:tcPr>
+            <w:tcW w:w="0" w:type="auto"/>
+            <w:tcBorders>
+              <w:top w:val="single" w:sz="6" w:space="0" w:color="auto"/>
+              <w:left w:val="single" w:sz="6" w:space="0" w:color="auto"/>
+              <w:bottom w:val="single" w:sz="6" w:space="0" w:color="auto"/>
+              <w:right w:val="single" w:sz="6" w:space="0" w:color="auto"/>
+            </w:tcBorders>
+            <w:vAlign w:val="center"/>
+            <w:hideMark/>
+          </w:tcPr>
+          <w:p>
+            <w:r>
+              <w:rPr>
+                <w:b/>
+                <w:bCs/>
+              </w:rPr>
+              <w:t>Entrega</w:t>
+            </w:r>
+          </w:p>
+        </w:tc>
+        <w:tc>
+          <w:tcPr>
+            <w:tcW w:w="0" w:type="auto"/>
+            <w:tcBorders>
+              <w:top w:val="single" w:sz="6" w:space="0" w:color="auto"/>
+              <w:left w:val="single" w:sz="6" w:space="0" w:color="auto"/>
+              <w:bottom w:val="single" w:sz="6" w:space="0" w:color="auto"/>
+              <w:right w:val="single" w:sz="6" w:space="0" w:color="auto"/>
+            </w:tcBorders>
+            <w:vAlign w:val="center"/>
+            <w:hideMark/>
+          </w:tcPr>
+          <w:p>
+            <w:r>
+              <w:t>Cadena de Frío, Recepción</w:t>
+            </w:r>
+          </w:p>
+        </w:tc>
+        <w:tc>
+          <w:tcPr>
+            <w:tcW w:w="0" w:type="auto"/>
+            <w:tcBorders>
+              <w:top w:val="single" w:sz="6" w:space="0" w:color="auto"/>
+              <w:left w:val="single" w:sz="6" w:space="0" w:color="auto"/>
+              <w:bottom w:val="single" w:sz="6" w:space="0" w:color="auto"/>
+              <w:right w:val="single" w:sz="6" w:space="0" w:color="auto"/>
+            </w:tcBorders>
+            <w:vAlign w:val="center"/>
+            <w:hideMark/>
+          </w:tcPr>
+          <w:p>
+            <w:r>
+              <w:t>FO-OP-17</w:t>
+            </w:r>
+          </w:p>
+        </w:tc>
+        <w:tc>
+          <w:tcPr>
+            <w:tcW w:w="0" w:type="auto"/>
+            <w:tcBorders>
+              <w:top w:val="single" w:sz="6" w:space="0" w:color="auto"/>
+              <w:left w:val="single" w:sz="6" w:space="0" w:color="auto"/>
+              <w:bottom w:val="single" w:sz="6" w:space="0" w:color="auto"/>
+              <w:right w:val="single" w:sz="6" w:space="0" w:color="auto"/>
+            </w:tcBorders>
+            <w:vAlign w:val="center"/>
+            <w:hideMark/>
+          </w:tcPr>
+          <w:p>
+            <w:r>
+              <w:t>Logística / Mensajería</w:t>
+            </w:r>
+          </w:p>
+        </w:tc>
+      </w:tr>
+    </w:tbl>
     <w:p/>
     <w:p/>
     <w:p/>
@@ -251,24 +1502,3191 @@
     <w:p/>
     <w:p/>
     <w:p/>
+    <w:p>
+      <w:pPr>
+        <w:rPr>
+          <w:b/>
+          <w:bCs/>
+        </w:rPr>
+      </w:pPr>
+      <w:r>
+        <w:lastRenderedPageBreak/>
+        <w:br/>
+      </w:r>
+      <w:r>
+        <w:br/>
+      </w:r>
+      <w:r>
+        <w:br/>
+      </w:r>
+      <w:r>
+        <w:br/>
+      </w:r>
+      <w:proofErr w:type="spellStart"/>
+      <w:r>
+        <w:rPr>
+          <w:b/>
+          <w:bCs/>
+        </w:rPr>
+        <w:t>abla</w:t>
+      </w:r>
+      <w:proofErr w:type="spellEnd"/>
+      <w:r>
+        <w:rPr>
+          <w:b/>
+          <w:bCs/>
+        </w:rPr>
+        <w:t xml:space="preserve"> de Control Documental del Sistema Xelle V1</w:t>
+      </w:r>
+    </w:p>
+    <w:tbl>
+      <w:tblPr>
+        <w:tblW w:w="0" w:type="auto"/>
+        <w:tblCellSpacing w:w="15" w:type="dxa"/>
+        <w:tblCellMar>
+          <w:top w:w="15" w:type="dxa"/>
+          <w:left w:w="15" w:type="dxa"/>
+          <w:bottom w:w="15" w:type="dxa"/>
+          <w:right w:w="15" w:type="dxa"/>
+        </w:tblCellMar>
+        <w:tblLook w:val="04A0" w:firstRow="1" w:lastRow="0" w:firstColumn="1" w:lastColumn="0" w:noHBand="0" w:noVBand="1"/>
+      </w:tblPr>
+      <w:tblGrid>
+        <w:gridCol w:w="1505"/>
+        <w:gridCol w:w="779"/>
+        <w:gridCol w:w="1493"/>
+        <w:gridCol w:w="2031"/>
+        <w:gridCol w:w="3014"/>
+      </w:tblGrid>
+      <w:tr>
+        <w:trPr>
+          <w:tblHeader/>
+          <w:tblCellSpacing w:w="15" w:type="dxa"/>
+        </w:trPr>
+        <w:tc>
+          <w:tcPr>
+            <w:tcW w:w="0" w:type="auto"/>
+            <w:tcBorders>
+              <w:top w:val="single" w:sz="6" w:space="0" w:color="auto"/>
+              <w:left w:val="single" w:sz="6" w:space="0" w:color="auto"/>
+              <w:bottom w:val="single" w:sz="6" w:space="0" w:color="auto"/>
+              <w:right w:val="single" w:sz="6" w:space="0" w:color="auto"/>
+            </w:tcBorders>
+            <w:vAlign w:val="center"/>
+            <w:hideMark/>
+          </w:tcPr>
+          <w:p>
+            <w:r>
+              <w:rPr>
+                <w:b/>
+                <w:bCs/>
+              </w:rPr>
+              <w:t>Etapa</w:t>
+            </w:r>
+          </w:p>
+        </w:tc>
+        <w:tc>
+          <w:tcPr>
+            <w:tcW w:w="0" w:type="auto"/>
+            <w:tcBorders>
+              <w:top w:val="single" w:sz="6" w:space="0" w:color="auto"/>
+              <w:left w:val="single" w:sz="6" w:space="0" w:color="auto"/>
+              <w:bottom w:val="single" w:sz="6" w:space="0" w:color="auto"/>
+              <w:right w:val="single" w:sz="6" w:space="0" w:color="auto"/>
+            </w:tcBorders>
+            <w:vAlign w:val="center"/>
+            <w:hideMark/>
+          </w:tcPr>
+          <w:p>
+            <w:r>
+              <w:rPr>
+                <w:b/>
+                <w:bCs/>
+              </w:rPr>
+              <w:t>Código</w:t>
+            </w:r>
+          </w:p>
+        </w:tc>
+        <w:tc>
+          <w:tcPr>
+            <w:tcW w:w="0" w:type="auto"/>
+            <w:tcBorders>
+              <w:top w:val="single" w:sz="6" w:space="0" w:color="auto"/>
+              <w:left w:val="single" w:sz="6" w:space="0" w:color="auto"/>
+              <w:bottom w:val="single" w:sz="6" w:space="0" w:color="auto"/>
+              <w:right w:val="single" w:sz="6" w:space="0" w:color="auto"/>
+            </w:tcBorders>
+            <w:vAlign w:val="center"/>
+            <w:hideMark/>
+          </w:tcPr>
+          <w:p>
+            <w:r>
+              <w:rPr>
+                <w:b/>
+                <w:bCs/>
+              </w:rPr>
+              <w:t>Nombre del Formato</w:t>
+            </w:r>
+          </w:p>
+        </w:tc>
+        <w:tc>
+          <w:tcPr>
+            <w:tcW w:w="0" w:type="auto"/>
+            <w:tcBorders>
+              <w:top w:val="single" w:sz="6" w:space="0" w:color="auto"/>
+              <w:left w:val="single" w:sz="6" w:space="0" w:color="auto"/>
+              <w:bottom w:val="single" w:sz="6" w:space="0" w:color="auto"/>
+              <w:right w:val="single" w:sz="6" w:space="0" w:color="auto"/>
+            </w:tcBorders>
+            <w:vAlign w:val="center"/>
+            <w:hideMark/>
+          </w:tcPr>
+          <w:p>
+            <w:r>
+              <w:rPr>
+                <w:b/>
+                <w:bCs/>
+              </w:rPr>
+              <w:t>PR / IT (Referencia)</w:t>
+            </w:r>
+          </w:p>
+        </w:tc>
+        <w:tc>
+          <w:tcPr>
+            <w:tcW w:w="0" w:type="auto"/>
+            <w:tcBorders>
+              <w:top w:val="single" w:sz="6" w:space="0" w:color="auto"/>
+              <w:left w:val="single" w:sz="6" w:space="0" w:color="auto"/>
+              <w:bottom w:val="single" w:sz="6" w:space="0" w:color="auto"/>
+              <w:right w:val="single" w:sz="6" w:space="0" w:color="auto"/>
+            </w:tcBorders>
+            <w:vAlign w:val="center"/>
+            <w:hideMark/>
+          </w:tcPr>
+          <w:p>
+            <w:r>
+              <w:rPr>
+                <w:b/>
+                <w:bCs/>
+              </w:rPr>
+              <w:t>Función Crítica / Lógica JS</w:t>
+            </w:r>
+          </w:p>
+        </w:tc>
+      </w:tr>
+      <w:tr>
+        <w:trPr>
+          <w:tblCellSpacing w:w="15" w:type="dxa"/>
+        </w:trPr>
+        <w:tc>
+          <w:tcPr>
+            <w:tcW w:w="0" w:type="auto"/>
+            <w:tcBorders>
+              <w:top w:val="single" w:sz="6" w:space="0" w:color="auto"/>
+              <w:left w:val="single" w:sz="6" w:space="0" w:color="auto"/>
+              <w:bottom w:val="single" w:sz="6" w:space="0" w:color="auto"/>
+              <w:right w:val="single" w:sz="6" w:space="0" w:color="auto"/>
+            </w:tcBorders>
+            <w:vAlign w:val="center"/>
+            <w:hideMark/>
+          </w:tcPr>
+          <w:p>
+            <w:r>
+              <w:rPr>
+                <w:b/>
+                <w:bCs/>
+              </w:rPr>
+              <w:t>1. COMERCIAL</w:t>
+            </w:r>
+          </w:p>
+        </w:tc>
+        <w:tc>
+          <w:tcPr>
+            <w:tcW w:w="0" w:type="auto"/>
+            <w:tcBorders>
+              <w:top w:val="single" w:sz="6" w:space="0" w:color="auto"/>
+              <w:left w:val="single" w:sz="6" w:space="0" w:color="auto"/>
+              <w:bottom w:val="single" w:sz="6" w:space="0" w:color="auto"/>
+              <w:right w:val="single" w:sz="6" w:space="0" w:color="auto"/>
+            </w:tcBorders>
+            <w:vAlign w:val="center"/>
+            <w:hideMark/>
+          </w:tcPr>
+          <w:p>
+            <w:r>
+              <w:rPr>
+                <w:b/>
+                <w:bCs/>
+              </w:rPr>
+              <w:t>FO-OP-15</w:t>
+            </w:r>
+          </w:p>
+        </w:tc>
+        <w:tc>
+          <w:tcPr>
+            <w:tcW w:w="0" w:type="auto"/>
+            <w:tcBorders>
+              <w:top w:val="single" w:sz="6" w:space="0" w:color="auto"/>
+              <w:left w:val="single" w:sz="6" w:space="0" w:color="auto"/>
+              <w:bottom w:val="single" w:sz="6" w:space="0" w:color="auto"/>
+              <w:right w:val="single" w:sz="6" w:space="0" w:color="auto"/>
+            </w:tcBorders>
+            <w:vAlign w:val="center"/>
+            <w:hideMark/>
+          </w:tcPr>
+          <w:p>
+            <w:r>
+              <w:t>Pedido Maestro</w:t>
+            </w:r>
+          </w:p>
+        </w:tc>
+        <w:tc>
+          <w:tcPr>
+            <w:tcW w:w="0" w:type="auto"/>
+            <w:tcBorders>
+              <w:top w:val="single" w:sz="6" w:space="0" w:color="auto"/>
+              <w:left w:val="single" w:sz="6" w:space="0" w:color="auto"/>
+              <w:bottom w:val="single" w:sz="6" w:space="0" w:color="auto"/>
+              <w:right w:val="single" w:sz="6" w:space="0" w:color="auto"/>
+            </w:tcBorders>
+            <w:vAlign w:val="center"/>
+            <w:hideMark/>
+          </w:tcPr>
+          <w:p>
+            <w:r>
+              <w:t>PR-COM-01 (Gestión de Ventas)</w:t>
+            </w:r>
+          </w:p>
+        </w:tc>
+        <w:tc>
+          <w:tcPr>
+            <w:tcW w:w="0" w:type="auto"/>
+            <w:tcBorders>
+              <w:top w:val="single" w:sz="6" w:space="0" w:color="auto"/>
+              <w:left w:val="single" w:sz="6" w:space="0" w:color="auto"/>
+              <w:bottom w:val="single" w:sz="6" w:space="0" w:color="auto"/>
+              <w:right w:val="single" w:sz="6" w:space="0" w:color="auto"/>
+            </w:tcBorders>
+            <w:vAlign w:val="center"/>
+            <w:hideMark/>
+          </w:tcPr>
+          <w:p>
+            <w:r>
+              <w:rPr>
+                <w:b/>
+                <w:bCs/>
+              </w:rPr>
+              <w:t>Entrada:</w:t>
+            </w:r>
+            <w:r>
+              <w:t xml:space="preserve"> Registra solicitud del cliente y define ruta de producción (Stock vs Fabricación).</w:t>
+            </w:r>
+          </w:p>
+        </w:tc>
+      </w:tr>
+      <w:tr>
+        <w:trPr>
+          <w:tblCellSpacing w:w="15" w:type="dxa"/>
+        </w:trPr>
+        <w:tc>
+          <w:tcPr>
+            <w:tcW w:w="0" w:type="auto"/>
+            <w:tcBorders>
+              <w:top w:val="single" w:sz="6" w:space="0" w:color="auto"/>
+              <w:left w:val="single" w:sz="6" w:space="0" w:color="auto"/>
+              <w:bottom w:val="single" w:sz="6" w:space="0" w:color="auto"/>
+              <w:right w:val="single" w:sz="6" w:space="0" w:color="auto"/>
+            </w:tcBorders>
+            <w:vAlign w:val="center"/>
+            <w:hideMark/>
+          </w:tcPr>
+          <w:p/>
+        </w:tc>
+        <w:tc>
+          <w:tcPr>
+            <w:tcW w:w="0" w:type="auto"/>
+            <w:tcBorders>
+              <w:top w:val="single" w:sz="6" w:space="0" w:color="auto"/>
+              <w:left w:val="single" w:sz="6" w:space="0" w:color="auto"/>
+              <w:bottom w:val="single" w:sz="6" w:space="0" w:color="auto"/>
+              <w:right w:val="single" w:sz="6" w:space="0" w:color="auto"/>
+            </w:tcBorders>
+            <w:vAlign w:val="center"/>
+            <w:hideMark/>
+          </w:tcPr>
+          <w:p>
+            <w:r>
+              <w:rPr>
+                <w:b/>
+                <w:bCs/>
+              </w:rPr>
+              <w:t>FO-OP-16</w:t>
+            </w:r>
+          </w:p>
+        </w:tc>
+        <w:tc>
+          <w:tcPr>
+            <w:tcW w:w="0" w:type="auto"/>
+            <w:tcBorders>
+              <w:top w:val="single" w:sz="6" w:space="0" w:color="auto"/>
+              <w:left w:val="single" w:sz="6" w:space="0" w:color="auto"/>
+              <w:bottom w:val="single" w:sz="6" w:space="0" w:color="auto"/>
+              <w:right w:val="single" w:sz="6" w:space="0" w:color="auto"/>
+            </w:tcBorders>
+            <w:vAlign w:val="center"/>
+            <w:hideMark/>
+          </w:tcPr>
+          <w:p>
+            <w:r>
+              <w:t>Orden de Surtido</w:t>
+            </w:r>
+          </w:p>
+        </w:tc>
+        <w:tc>
+          <w:tcPr>
+            <w:tcW w:w="0" w:type="auto"/>
+            <w:tcBorders>
+              <w:top w:val="single" w:sz="6" w:space="0" w:color="auto"/>
+              <w:left w:val="single" w:sz="6" w:space="0" w:color="auto"/>
+              <w:bottom w:val="single" w:sz="6" w:space="0" w:color="auto"/>
+              <w:right w:val="single" w:sz="6" w:space="0" w:color="auto"/>
+            </w:tcBorders>
+            <w:vAlign w:val="center"/>
+            <w:hideMark/>
+          </w:tcPr>
+          <w:p>
+            <w:pPr>
+              <w:rPr>
+                <w:lang w:val="en-US"/>
+              </w:rPr>
+            </w:pPr>
+            <w:r>
+              <w:rPr>
+                <w:lang w:val="en-US"/>
+              </w:rPr>
+              <w:t>IT-LOG-02 (Picking y Packing)</w:t>
+            </w:r>
+          </w:p>
+        </w:tc>
+        <w:tc>
+          <w:tcPr>
+            <w:tcW w:w="0" w:type="auto"/>
+            <w:tcBorders>
+              <w:top w:val="single" w:sz="6" w:space="0" w:color="auto"/>
+              <w:left w:val="single" w:sz="6" w:space="0" w:color="auto"/>
+              <w:bottom w:val="single" w:sz="6" w:space="0" w:color="auto"/>
+              <w:right w:val="single" w:sz="6" w:space="0" w:color="auto"/>
+            </w:tcBorders>
+            <w:vAlign w:val="center"/>
+            <w:hideMark/>
+          </w:tcPr>
+          <w:p>
+            <w:r>
+              <w:rPr>
+                <w:b/>
+                <w:bCs/>
+              </w:rPr>
+              <w:t>Logística:</w:t>
+            </w:r>
+            <w:r>
+              <w:t xml:space="preserve"> Instrucción automatizada al almacén para preparar el pedido validado.</w:t>
+            </w:r>
+          </w:p>
+        </w:tc>
+      </w:tr>
+      <w:tr>
+        <w:trPr>
+          <w:tblCellSpacing w:w="15" w:type="dxa"/>
+        </w:trPr>
+        <w:tc>
+          <w:tcPr>
+            <w:tcW w:w="0" w:type="auto"/>
+            <w:tcBorders>
+              <w:top w:val="single" w:sz="6" w:space="0" w:color="auto"/>
+              <w:left w:val="single" w:sz="6" w:space="0" w:color="auto"/>
+              <w:bottom w:val="single" w:sz="6" w:space="0" w:color="auto"/>
+              <w:right w:val="single" w:sz="6" w:space="0" w:color="auto"/>
+            </w:tcBorders>
+            <w:vAlign w:val="center"/>
+            <w:hideMark/>
+          </w:tcPr>
+          <w:p>
+            <w:r>
+              <w:rPr>
+                <w:b/>
+                <w:bCs/>
+              </w:rPr>
+              <w:t>2. INGRESO LAB</w:t>
+            </w:r>
+          </w:p>
+        </w:tc>
+        <w:tc>
+          <w:tcPr>
+            <w:tcW w:w="0" w:type="auto"/>
+            <w:tcBorders>
+              <w:top w:val="single" w:sz="6" w:space="0" w:color="auto"/>
+              <w:left w:val="single" w:sz="6" w:space="0" w:color="auto"/>
+              <w:bottom w:val="single" w:sz="6" w:space="0" w:color="auto"/>
+              <w:right w:val="single" w:sz="6" w:space="0" w:color="auto"/>
+            </w:tcBorders>
+            <w:vAlign w:val="center"/>
+            <w:hideMark/>
+          </w:tcPr>
+          <w:p>
+            <w:r>
+              <w:rPr>
+                <w:b/>
+                <w:bCs/>
+              </w:rPr>
+              <w:t>FO-LC-17</w:t>
+            </w:r>
+          </w:p>
+        </w:tc>
+        <w:tc>
+          <w:tcPr>
+            <w:tcW w:w="0" w:type="auto"/>
+            <w:tcBorders>
+              <w:top w:val="single" w:sz="6" w:space="0" w:color="auto"/>
+              <w:left w:val="single" w:sz="6" w:space="0" w:color="auto"/>
+              <w:bottom w:val="single" w:sz="6" w:space="0" w:color="auto"/>
+              <w:right w:val="single" w:sz="6" w:space="0" w:color="auto"/>
+            </w:tcBorders>
+            <w:vAlign w:val="center"/>
+            <w:hideMark/>
+          </w:tcPr>
+          <w:p>
+            <w:r>
+              <w:t>Recepción Muestras</w:t>
+            </w:r>
+          </w:p>
+        </w:tc>
+        <w:tc>
+          <w:tcPr>
+            <w:tcW w:w="0" w:type="auto"/>
+            <w:tcBorders>
+              <w:top w:val="single" w:sz="6" w:space="0" w:color="auto"/>
+              <w:left w:val="single" w:sz="6" w:space="0" w:color="auto"/>
+              <w:bottom w:val="single" w:sz="6" w:space="0" w:color="auto"/>
+              <w:right w:val="single" w:sz="6" w:space="0" w:color="auto"/>
+            </w:tcBorders>
+            <w:vAlign w:val="center"/>
+            <w:hideMark/>
+          </w:tcPr>
+          <w:p>
+            <w:r>
+              <w:t>PR-PRO-01 (Recepción MP)</w:t>
+            </w:r>
+          </w:p>
+        </w:tc>
+        <w:tc>
+          <w:tcPr>
+            <w:tcW w:w="0" w:type="auto"/>
+            <w:tcBorders>
+              <w:top w:val="single" w:sz="6" w:space="0" w:color="auto"/>
+              <w:left w:val="single" w:sz="6" w:space="0" w:color="auto"/>
+              <w:bottom w:val="single" w:sz="6" w:space="0" w:color="auto"/>
+              <w:right w:val="single" w:sz="6" w:space="0" w:color="auto"/>
+            </w:tcBorders>
+            <w:vAlign w:val="center"/>
+            <w:hideMark/>
+          </w:tcPr>
+          <w:p>
+            <w:r>
+              <w:rPr>
+                <w:b/>
+                <w:bCs/>
+              </w:rPr>
+              <w:t>Trazabilidad:</w:t>
+            </w:r>
+            <w:r>
+              <w:t xml:space="preserve"> Genera ID único de donante y valida condiciones de llegada (Temp, Hora).</w:t>
+            </w:r>
+          </w:p>
+        </w:tc>
+      </w:tr>
+      <w:tr>
+        <w:trPr>
+          <w:tblCellSpacing w:w="15" w:type="dxa"/>
+        </w:trPr>
+        <w:tc>
+          <w:tcPr>
+            <w:tcW w:w="0" w:type="auto"/>
+            <w:tcBorders>
+              <w:top w:val="single" w:sz="6" w:space="0" w:color="auto"/>
+              <w:left w:val="single" w:sz="6" w:space="0" w:color="auto"/>
+              <w:bottom w:val="single" w:sz="6" w:space="0" w:color="auto"/>
+              <w:right w:val="single" w:sz="6" w:space="0" w:color="auto"/>
+            </w:tcBorders>
+            <w:vAlign w:val="center"/>
+            <w:hideMark/>
+          </w:tcPr>
+          <w:p/>
+        </w:tc>
+        <w:tc>
+          <w:tcPr>
+            <w:tcW w:w="0" w:type="auto"/>
+            <w:tcBorders>
+              <w:top w:val="single" w:sz="6" w:space="0" w:color="auto"/>
+              <w:left w:val="single" w:sz="6" w:space="0" w:color="auto"/>
+              <w:bottom w:val="single" w:sz="6" w:space="0" w:color="auto"/>
+              <w:right w:val="single" w:sz="6" w:space="0" w:color="auto"/>
+            </w:tcBorders>
+            <w:vAlign w:val="center"/>
+            <w:hideMark/>
+          </w:tcPr>
+          <w:p>
+            <w:r>
+              <w:rPr>
+                <w:b/>
+                <w:bCs/>
+              </w:rPr>
+              <w:t>FO-LC-18</w:t>
+            </w:r>
+          </w:p>
+        </w:tc>
+        <w:tc>
+          <w:tcPr>
+            <w:tcW w:w="0" w:type="auto"/>
+            <w:tcBorders>
+              <w:top w:val="single" w:sz="6" w:space="0" w:color="auto"/>
+              <w:left w:val="single" w:sz="6" w:space="0" w:color="auto"/>
+              <w:bottom w:val="single" w:sz="6" w:space="0" w:color="auto"/>
+              <w:right w:val="single" w:sz="6" w:space="0" w:color="auto"/>
+            </w:tcBorders>
+            <w:vAlign w:val="center"/>
+            <w:hideMark/>
+          </w:tcPr>
+          <w:p>
+            <w:r>
+              <w:t>Evaluación Macro</w:t>
+            </w:r>
+          </w:p>
+        </w:tc>
+        <w:tc>
+          <w:tcPr>
+            <w:tcW w:w="0" w:type="auto"/>
+            <w:tcBorders>
+              <w:top w:val="single" w:sz="6" w:space="0" w:color="auto"/>
+              <w:left w:val="single" w:sz="6" w:space="0" w:color="auto"/>
+              <w:bottom w:val="single" w:sz="6" w:space="0" w:color="auto"/>
+              <w:right w:val="single" w:sz="6" w:space="0" w:color="auto"/>
+            </w:tcBorders>
+            <w:vAlign w:val="center"/>
+            <w:hideMark/>
+          </w:tcPr>
+          <w:p>
+            <w:r>
+              <w:t>IT-CAL-03 (Inspección Tejidos)</w:t>
+            </w:r>
+          </w:p>
+        </w:tc>
+        <w:tc>
+          <w:tcPr>
+            <w:tcW w:w="0" w:type="auto"/>
+            <w:tcBorders>
+              <w:top w:val="single" w:sz="6" w:space="0" w:color="auto"/>
+              <w:left w:val="single" w:sz="6" w:space="0" w:color="auto"/>
+              <w:bottom w:val="single" w:sz="6" w:space="0" w:color="auto"/>
+              <w:right w:val="single" w:sz="6" w:space="0" w:color="auto"/>
+            </w:tcBorders>
+            <w:vAlign w:val="center"/>
+            <w:hideMark/>
+          </w:tcPr>
+          <w:p>
+            <w:r>
+              <w:rPr>
+                <w:b/>
+                <w:bCs/>
+              </w:rPr>
+              <w:t>Filtro Físico:</w:t>
+            </w:r>
+            <w:r>
+              <w:t xml:space="preserve"> Evalúa integridad y características morfológicas para aceptar/rechazar tejido.</w:t>
+            </w:r>
+          </w:p>
+        </w:tc>
+      </w:tr>
+      <w:tr>
+        <w:trPr>
+          <w:tblCellSpacing w:w="15" w:type="dxa"/>
+        </w:trPr>
+        <w:tc>
+          <w:tcPr>
+            <w:tcW w:w="0" w:type="auto"/>
+            <w:tcBorders>
+              <w:top w:val="single" w:sz="6" w:space="0" w:color="auto"/>
+              <w:left w:val="single" w:sz="6" w:space="0" w:color="auto"/>
+              <w:bottom w:val="single" w:sz="6" w:space="0" w:color="auto"/>
+              <w:right w:val="single" w:sz="6" w:space="0" w:color="auto"/>
+            </w:tcBorders>
+            <w:vAlign w:val="center"/>
+            <w:hideMark/>
+          </w:tcPr>
+          <w:p/>
+        </w:tc>
+        <w:tc>
+          <w:tcPr>
+            <w:tcW w:w="0" w:type="auto"/>
+            <w:tcBorders>
+              <w:top w:val="single" w:sz="6" w:space="0" w:color="auto"/>
+              <w:left w:val="single" w:sz="6" w:space="0" w:color="auto"/>
+              <w:bottom w:val="single" w:sz="6" w:space="0" w:color="auto"/>
+              <w:right w:val="single" w:sz="6" w:space="0" w:color="auto"/>
+            </w:tcBorders>
+            <w:vAlign w:val="center"/>
+            <w:hideMark/>
+          </w:tcPr>
+          <w:p>
+            <w:r>
+              <w:rPr>
+                <w:b/>
+                <w:bCs/>
+              </w:rPr>
+              <w:t>FO-LC-19</w:t>
+            </w:r>
+          </w:p>
+        </w:tc>
+        <w:tc>
+          <w:tcPr>
+            <w:tcW w:w="0" w:type="auto"/>
+            <w:tcBorders>
+              <w:top w:val="single" w:sz="6" w:space="0" w:color="auto"/>
+              <w:left w:val="single" w:sz="6" w:space="0" w:color="auto"/>
+              <w:bottom w:val="single" w:sz="6" w:space="0" w:color="auto"/>
+              <w:right w:val="single" w:sz="6" w:space="0" w:color="auto"/>
+            </w:tcBorders>
+            <w:vAlign w:val="center"/>
+            <w:hideMark/>
+          </w:tcPr>
+          <w:p>
+            <w:r>
+              <w:t>Evaluación Calidad</w:t>
+            </w:r>
+          </w:p>
+        </w:tc>
+        <w:tc>
+          <w:tcPr>
+            <w:tcW w:w="0" w:type="auto"/>
+            <w:tcBorders>
+              <w:top w:val="single" w:sz="6" w:space="0" w:color="auto"/>
+              <w:left w:val="single" w:sz="6" w:space="0" w:color="auto"/>
+              <w:bottom w:val="single" w:sz="6" w:space="0" w:color="auto"/>
+              <w:right w:val="single" w:sz="6" w:space="0" w:color="auto"/>
+            </w:tcBorders>
+            <w:vAlign w:val="center"/>
+            <w:hideMark/>
+          </w:tcPr>
+          <w:p>
+            <w:r>
+              <w:t>PR-CAL-02 (Liberación MP)</w:t>
+            </w:r>
+          </w:p>
+        </w:tc>
+        <w:tc>
+          <w:tcPr>
+            <w:tcW w:w="0" w:type="auto"/>
+            <w:tcBorders>
+              <w:top w:val="single" w:sz="6" w:space="0" w:color="auto"/>
+              <w:left w:val="single" w:sz="6" w:space="0" w:color="auto"/>
+              <w:bottom w:val="single" w:sz="6" w:space="0" w:color="auto"/>
+              <w:right w:val="single" w:sz="6" w:space="0" w:color="auto"/>
+            </w:tcBorders>
+            <w:vAlign w:val="center"/>
+            <w:hideMark/>
+          </w:tcPr>
+          <w:p>
+            <w:r>
+              <w:rPr>
+                <w:b/>
+                <w:bCs/>
+              </w:rPr>
+              <w:t>Filtro Biológico:</w:t>
+            </w:r>
+            <w:r>
+              <w:t xml:space="preserve"> Semáforo de seguridad (Serología negativa) previo al ingreso a áreas limpias.</w:t>
+            </w:r>
+          </w:p>
+        </w:tc>
+      </w:tr>
+      <w:tr>
+        <w:trPr>
+          <w:tblCellSpacing w:w="15" w:type="dxa"/>
+        </w:trPr>
+        <w:tc>
+          <w:tcPr>
+            <w:tcW w:w="0" w:type="auto"/>
+            <w:tcBorders>
+              <w:top w:val="single" w:sz="6" w:space="0" w:color="auto"/>
+              <w:left w:val="single" w:sz="6" w:space="0" w:color="auto"/>
+              <w:bottom w:val="single" w:sz="6" w:space="0" w:color="auto"/>
+              <w:right w:val="single" w:sz="6" w:space="0" w:color="auto"/>
+            </w:tcBorders>
+            <w:vAlign w:val="center"/>
+            <w:hideMark/>
+          </w:tcPr>
+          <w:p/>
+        </w:tc>
+        <w:tc>
+          <w:tcPr>
+            <w:tcW w:w="0" w:type="auto"/>
+            <w:tcBorders>
+              <w:top w:val="single" w:sz="6" w:space="0" w:color="auto"/>
+              <w:left w:val="single" w:sz="6" w:space="0" w:color="auto"/>
+              <w:bottom w:val="single" w:sz="6" w:space="0" w:color="auto"/>
+              <w:right w:val="single" w:sz="6" w:space="0" w:color="auto"/>
+            </w:tcBorders>
+            <w:vAlign w:val="center"/>
+            <w:hideMark/>
+          </w:tcPr>
+          <w:p>
+            <w:r>
+              <w:rPr>
+                <w:b/>
+                <w:bCs/>
+              </w:rPr>
+              <w:t>FO-LC-16</w:t>
+            </w:r>
+          </w:p>
+        </w:tc>
+        <w:tc>
+          <w:tcPr>
+            <w:tcW w:w="0" w:type="auto"/>
+            <w:tcBorders>
+              <w:top w:val="single" w:sz="6" w:space="0" w:color="auto"/>
+              <w:left w:val="single" w:sz="6" w:space="0" w:color="auto"/>
+              <w:bottom w:val="single" w:sz="6" w:space="0" w:color="auto"/>
+              <w:right w:val="single" w:sz="6" w:space="0" w:color="auto"/>
+            </w:tcBorders>
+            <w:vAlign w:val="center"/>
+            <w:hideMark/>
+          </w:tcPr>
+          <w:p>
+            <w:r>
+              <w:t>Resumen Recepción</w:t>
+            </w:r>
+          </w:p>
+        </w:tc>
+        <w:tc>
+          <w:tcPr>
+            <w:tcW w:w="0" w:type="auto"/>
+            <w:tcBorders>
+              <w:top w:val="single" w:sz="6" w:space="0" w:color="auto"/>
+              <w:left w:val="single" w:sz="6" w:space="0" w:color="auto"/>
+              <w:bottom w:val="single" w:sz="6" w:space="0" w:color="auto"/>
+              <w:right w:val="single" w:sz="6" w:space="0" w:color="auto"/>
+            </w:tcBorders>
+            <w:vAlign w:val="center"/>
+            <w:hideMark/>
+          </w:tcPr>
+          <w:p>
+            <w:r>
+              <w:t>PR-SGC-05 (Revisión Lote)</w:t>
+            </w:r>
+          </w:p>
+        </w:tc>
+        <w:tc>
+          <w:tcPr>
+            <w:tcW w:w="0" w:type="auto"/>
+            <w:tcBorders>
+              <w:top w:val="single" w:sz="6" w:space="0" w:color="auto"/>
+              <w:left w:val="single" w:sz="6" w:space="0" w:color="auto"/>
+              <w:bottom w:val="single" w:sz="6" w:space="0" w:color="auto"/>
+              <w:right w:val="single" w:sz="6" w:space="0" w:color="auto"/>
+            </w:tcBorders>
+            <w:vAlign w:val="center"/>
+            <w:hideMark/>
+          </w:tcPr>
+          <w:p>
+            <w:r>
+              <w:rPr>
+                <w:b/>
+                <w:bCs/>
+              </w:rPr>
+              <w:t xml:space="preserve">Cover </w:t>
+            </w:r>
+            <w:proofErr w:type="spellStart"/>
+            <w:r>
+              <w:rPr>
+                <w:b/>
+                <w:bCs/>
+              </w:rPr>
+              <w:t>Sheet</w:t>
+            </w:r>
+            <w:proofErr w:type="spellEnd"/>
+            <w:r>
+              <w:rPr>
+                <w:b/>
+                <w:bCs/>
+              </w:rPr>
+              <w:t>:</w:t>
+            </w:r>
+            <w:r>
+              <w:t xml:space="preserve"> Consolida FO-17, 18 y 19. Es la "llave" que autoriza el inicio del proceso.</w:t>
+            </w:r>
+          </w:p>
+        </w:tc>
+      </w:tr>
+      <w:tr>
+        <w:trPr>
+          <w:tblCellSpacing w:w="15" w:type="dxa"/>
+        </w:trPr>
+        <w:tc>
+          <w:tcPr>
+            <w:tcW w:w="0" w:type="auto"/>
+            <w:tcBorders>
+              <w:top w:val="single" w:sz="6" w:space="0" w:color="auto"/>
+              <w:left w:val="single" w:sz="6" w:space="0" w:color="auto"/>
+              <w:bottom w:val="single" w:sz="6" w:space="0" w:color="auto"/>
+              <w:right w:val="single" w:sz="6" w:space="0" w:color="auto"/>
+            </w:tcBorders>
+            <w:vAlign w:val="center"/>
+            <w:hideMark/>
+          </w:tcPr>
+          <w:p>
+            <w:r>
+              <w:rPr>
+                <w:b/>
+                <w:bCs/>
+              </w:rPr>
+              <w:t>3. PRODUCCIÓN</w:t>
+            </w:r>
+          </w:p>
+        </w:tc>
+        <w:tc>
+          <w:tcPr>
+            <w:tcW w:w="0" w:type="auto"/>
+            <w:tcBorders>
+              <w:top w:val="single" w:sz="6" w:space="0" w:color="auto"/>
+              <w:left w:val="single" w:sz="6" w:space="0" w:color="auto"/>
+              <w:bottom w:val="single" w:sz="6" w:space="0" w:color="auto"/>
+              <w:right w:val="single" w:sz="6" w:space="0" w:color="auto"/>
+            </w:tcBorders>
+            <w:vAlign w:val="center"/>
+            <w:hideMark/>
+          </w:tcPr>
+          <w:p>
+            <w:r>
+              <w:rPr>
+                <w:b/>
+                <w:bCs/>
+              </w:rPr>
+              <w:t>FO-LC-20</w:t>
+            </w:r>
+          </w:p>
+        </w:tc>
+        <w:tc>
+          <w:tcPr>
+            <w:tcW w:w="0" w:type="auto"/>
+            <w:tcBorders>
+              <w:top w:val="single" w:sz="6" w:space="0" w:color="auto"/>
+              <w:left w:val="single" w:sz="6" w:space="0" w:color="auto"/>
+              <w:bottom w:val="single" w:sz="6" w:space="0" w:color="auto"/>
+              <w:right w:val="single" w:sz="6" w:space="0" w:color="auto"/>
+            </w:tcBorders>
+            <w:vAlign w:val="center"/>
+            <w:hideMark/>
+          </w:tcPr>
+          <w:p>
+            <w:r>
+              <w:t>Procesamiento</w:t>
+            </w:r>
+          </w:p>
+        </w:tc>
+        <w:tc>
+          <w:tcPr>
+            <w:tcW w:w="0" w:type="auto"/>
+            <w:tcBorders>
+              <w:top w:val="single" w:sz="6" w:space="0" w:color="auto"/>
+              <w:left w:val="single" w:sz="6" w:space="0" w:color="auto"/>
+              <w:bottom w:val="single" w:sz="6" w:space="0" w:color="auto"/>
+              <w:right w:val="single" w:sz="6" w:space="0" w:color="auto"/>
+            </w:tcBorders>
+            <w:vAlign w:val="center"/>
+            <w:hideMark/>
+          </w:tcPr>
+          <w:p>
+            <w:r>
+              <w:t>PR-PRO-02 (Aislamiento Celular)</w:t>
+            </w:r>
+          </w:p>
+        </w:tc>
+        <w:tc>
+          <w:tcPr>
+            <w:tcW w:w="0" w:type="auto"/>
+            <w:tcBorders>
+              <w:top w:val="single" w:sz="6" w:space="0" w:color="auto"/>
+              <w:left w:val="single" w:sz="6" w:space="0" w:color="auto"/>
+              <w:bottom w:val="single" w:sz="6" w:space="0" w:color="auto"/>
+              <w:right w:val="single" w:sz="6" w:space="0" w:color="auto"/>
+            </w:tcBorders>
+            <w:vAlign w:val="center"/>
+            <w:hideMark/>
+          </w:tcPr>
+          <w:p>
+            <w:r>
+              <w:rPr>
+                <w:b/>
+                <w:bCs/>
+              </w:rPr>
+              <w:t>Núcleo:</w:t>
+            </w:r>
+            <w:r>
+              <w:t xml:space="preserve"> Transforma MP en Lote de Cultivo. Genera </w:t>
+            </w:r>
+            <w:proofErr w:type="gramStart"/>
+            <w:r>
+              <w:t>códigos padre</w:t>
+            </w:r>
+            <w:proofErr w:type="gramEnd"/>
+            <w:r>
+              <w:t xml:space="preserve"> (ej. TPL-DG).</w:t>
+            </w:r>
+          </w:p>
+        </w:tc>
+      </w:tr>
+      <w:tr>
+        <w:trPr>
+          <w:tblCellSpacing w:w="15" w:type="dxa"/>
+        </w:trPr>
+        <w:tc>
+          <w:tcPr>
+            <w:tcW w:w="0" w:type="auto"/>
+            <w:tcBorders>
+              <w:top w:val="single" w:sz="6" w:space="0" w:color="auto"/>
+              <w:left w:val="single" w:sz="6" w:space="0" w:color="auto"/>
+              <w:bottom w:val="single" w:sz="6" w:space="0" w:color="auto"/>
+              <w:right w:val="single" w:sz="6" w:space="0" w:color="auto"/>
+            </w:tcBorders>
+            <w:vAlign w:val="center"/>
+            <w:hideMark/>
+          </w:tcPr>
+          <w:p/>
+        </w:tc>
+        <w:tc>
+          <w:tcPr>
+            <w:tcW w:w="0" w:type="auto"/>
+            <w:tcBorders>
+              <w:top w:val="single" w:sz="6" w:space="0" w:color="auto"/>
+              <w:left w:val="single" w:sz="6" w:space="0" w:color="auto"/>
+              <w:bottom w:val="single" w:sz="6" w:space="0" w:color="auto"/>
+              <w:right w:val="single" w:sz="6" w:space="0" w:color="auto"/>
+            </w:tcBorders>
+            <w:vAlign w:val="center"/>
+            <w:hideMark/>
+          </w:tcPr>
+          <w:p>
+            <w:r>
+              <w:rPr>
+                <w:b/>
+                <w:bCs/>
+              </w:rPr>
+              <w:t>FO-LC-21</w:t>
+            </w:r>
+          </w:p>
+        </w:tc>
+        <w:tc>
+          <w:tcPr>
+            <w:tcW w:w="0" w:type="auto"/>
+            <w:tcBorders>
+              <w:top w:val="single" w:sz="6" w:space="0" w:color="auto"/>
+              <w:left w:val="single" w:sz="6" w:space="0" w:color="auto"/>
+              <w:bottom w:val="single" w:sz="6" w:space="0" w:color="auto"/>
+              <w:right w:val="single" w:sz="6" w:space="0" w:color="auto"/>
+            </w:tcBorders>
+            <w:vAlign w:val="center"/>
+            <w:hideMark/>
+          </w:tcPr>
+          <w:p>
+            <w:r>
+              <w:t>Bitácora Cultivo</w:t>
+            </w:r>
+          </w:p>
+        </w:tc>
+        <w:tc>
+          <w:tcPr>
+            <w:tcW w:w="0" w:type="auto"/>
+            <w:tcBorders>
+              <w:top w:val="single" w:sz="6" w:space="0" w:color="auto"/>
+              <w:left w:val="single" w:sz="6" w:space="0" w:color="auto"/>
+              <w:bottom w:val="single" w:sz="6" w:space="0" w:color="auto"/>
+              <w:right w:val="single" w:sz="6" w:space="0" w:color="auto"/>
+            </w:tcBorders>
+            <w:vAlign w:val="center"/>
+            <w:hideMark/>
+          </w:tcPr>
+          <w:p>
+            <w:r>
+              <w:t>IT-PRO-05 (Expansión Celular)</w:t>
+            </w:r>
+          </w:p>
+        </w:tc>
+        <w:tc>
+          <w:tcPr>
+            <w:tcW w:w="0" w:type="auto"/>
+            <w:tcBorders>
+              <w:top w:val="single" w:sz="6" w:space="0" w:color="auto"/>
+              <w:left w:val="single" w:sz="6" w:space="0" w:color="auto"/>
+              <w:bottom w:val="single" w:sz="6" w:space="0" w:color="auto"/>
+              <w:right w:val="single" w:sz="6" w:space="0" w:color="auto"/>
+            </w:tcBorders>
+            <w:vAlign w:val="center"/>
+            <w:hideMark/>
+          </w:tcPr>
+          <w:p>
+            <w:r>
+              <w:rPr>
+                <w:b/>
+                <w:bCs/>
+              </w:rPr>
+              <w:t>Genealogía:</w:t>
+            </w:r>
+            <w:r>
+              <w:t xml:space="preserve"> Controla la descendencia (P0 -&gt; P1), medios usados y cosecha final.</w:t>
+            </w:r>
+          </w:p>
+        </w:tc>
+      </w:tr>
+      <w:tr>
+        <w:trPr>
+          <w:tblCellSpacing w:w="15" w:type="dxa"/>
+        </w:trPr>
+        <w:tc>
+          <w:tcPr>
+            <w:tcW w:w="0" w:type="auto"/>
+            <w:tcBorders>
+              <w:top w:val="single" w:sz="6" w:space="0" w:color="auto"/>
+              <w:left w:val="single" w:sz="6" w:space="0" w:color="auto"/>
+              <w:bottom w:val="single" w:sz="6" w:space="0" w:color="auto"/>
+              <w:right w:val="single" w:sz="6" w:space="0" w:color="auto"/>
+            </w:tcBorders>
+            <w:vAlign w:val="center"/>
+            <w:hideMark/>
+          </w:tcPr>
+          <w:p/>
+        </w:tc>
+        <w:tc>
+          <w:tcPr>
+            <w:tcW w:w="0" w:type="auto"/>
+            <w:tcBorders>
+              <w:top w:val="single" w:sz="6" w:space="0" w:color="auto"/>
+              <w:left w:val="single" w:sz="6" w:space="0" w:color="auto"/>
+              <w:bottom w:val="single" w:sz="6" w:space="0" w:color="auto"/>
+              <w:right w:val="single" w:sz="6" w:space="0" w:color="auto"/>
+            </w:tcBorders>
+            <w:vAlign w:val="center"/>
+            <w:hideMark/>
+          </w:tcPr>
+          <w:p>
+            <w:r>
+              <w:rPr>
+                <w:b/>
+                <w:bCs/>
+              </w:rPr>
+              <w:t>FO-LC-40</w:t>
+            </w:r>
+          </w:p>
+        </w:tc>
+        <w:tc>
+          <w:tcPr>
+            <w:tcW w:w="0" w:type="auto"/>
+            <w:tcBorders>
+              <w:top w:val="single" w:sz="6" w:space="0" w:color="auto"/>
+              <w:left w:val="single" w:sz="6" w:space="0" w:color="auto"/>
+              <w:bottom w:val="single" w:sz="6" w:space="0" w:color="auto"/>
+              <w:right w:val="single" w:sz="6" w:space="0" w:color="auto"/>
+            </w:tcBorders>
+            <w:vAlign w:val="center"/>
+            <w:hideMark/>
+          </w:tcPr>
+          <w:p>
+            <w:proofErr w:type="spellStart"/>
+            <w:r>
+              <w:t>Prep</w:t>
+            </w:r>
+            <w:proofErr w:type="spellEnd"/>
+            <w:r>
+              <w:t>. Medios</w:t>
+            </w:r>
+          </w:p>
+        </w:tc>
+        <w:tc>
+          <w:tcPr>
+            <w:tcW w:w="0" w:type="auto"/>
+            <w:tcBorders>
+              <w:top w:val="single" w:sz="6" w:space="0" w:color="auto"/>
+              <w:left w:val="single" w:sz="6" w:space="0" w:color="auto"/>
+              <w:bottom w:val="single" w:sz="6" w:space="0" w:color="auto"/>
+              <w:right w:val="single" w:sz="6" w:space="0" w:color="auto"/>
+            </w:tcBorders>
+            <w:vAlign w:val="center"/>
+            <w:hideMark/>
+          </w:tcPr>
+          <w:p>
+            <w:r>
+              <w:t>IT-SOP-01 (</w:t>
+            </w:r>
+            <w:proofErr w:type="spellStart"/>
+            <w:r>
+              <w:t>Prep</w:t>
+            </w:r>
+            <w:proofErr w:type="spellEnd"/>
+            <w:r>
+              <w:t>. Soluciones)</w:t>
+            </w:r>
+          </w:p>
+        </w:tc>
+        <w:tc>
+          <w:tcPr>
+            <w:tcW w:w="0" w:type="auto"/>
+            <w:tcBorders>
+              <w:top w:val="single" w:sz="6" w:space="0" w:color="auto"/>
+              <w:left w:val="single" w:sz="6" w:space="0" w:color="auto"/>
+              <w:bottom w:val="single" w:sz="6" w:space="0" w:color="auto"/>
+              <w:right w:val="single" w:sz="6" w:space="0" w:color="auto"/>
+            </w:tcBorders>
+            <w:vAlign w:val="center"/>
+            <w:hideMark/>
+          </w:tcPr>
+          <w:p>
+            <w:r>
+              <w:rPr>
+                <w:b/>
+                <w:bCs/>
+              </w:rPr>
+              <w:t>Soporte:</w:t>
+            </w:r>
+            <w:r>
+              <w:t xml:space="preserve"> Genera lotes internos de medios/soluciones con cálculo de caducidad.</w:t>
+            </w:r>
+          </w:p>
+        </w:tc>
+      </w:tr>
+      <w:tr>
+        <w:trPr>
+          <w:tblCellSpacing w:w="15" w:type="dxa"/>
+        </w:trPr>
+        <w:tc>
+          <w:tcPr>
+            <w:tcW w:w="0" w:type="auto"/>
+            <w:tcBorders>
+              <w:top w:val="single" w:sz="6" w:space="0" w:color="auto"/>
+              <w:left w:val="single" w:sz="6" w:space="0" w:color="auto"/>
+              <w:bottom w:val="single" w:sz="6" w:space="0" w:color="auto"/>
+              <w:right w:val="single" w:sz="6" w:space="0" w:color="auto"/>
+            </w:tcBorders>
+            <w:vAlign w:val="center"/>
+            <w:hideMark/>
+          </w:tcPr>
+          <w:p/>
+        </w:tc>
+        <w:tc>
+          <w:tcPr>
+            <w:tcW w:w="0" w:type="auto"/>
+            <w:tcBorders>
+              <w:top w:val="single" w:sz="6" w:space="0" w:color="auto"/>
+              <w:left w:val="single" w:sz="6" w:space="0" w:color="auto"/>
+              <w:bottom w:val="single" w:sz="6" w:space="0" w:color="auto"/>
+              <w:right w:val="single" w:sz="6" w:space="0" w:color="auto"/>
+            </w:tcBorders>
+            <w:vAlign w:val="center"/>
+            <w:hideMark/>
+          </w:tcPr>
+          <w:p>
+            <w:r>
+              <w:rPr>
+                <w:b/>
+                <w:bCs/>
+              </w:rPr>
+              <w:t>FO-LC-40-B</w:t>
+            </w:r>
+          </w:p>
+        </w:tc>
+        <w:tc>
+          <w:tcPr>
+            <w:tcW w:w="0" w:type="auto"/>
+            <w:tcBorders>
+              <w:top w:val="single" w:sz="6" w:space="0" w:color="auto"/>
+              <w:left w:val="single" w:sz="6" w:space="0" w:color="auto"/>
+              <w:bottom w:val="single" w:sz="6" w:space="0" w:color="auto"/>
+              <w:right w:val="single" w:sz="6" w:space="0" w:color="auto"/>
+            </w:tcBorders>
+            <w:vAlign w:val="center"/>
+            <w:hideMark/>
+          </w:tcPr>
+          <w:p>
+            <w:proofErr w:type="spellStart"/>
+            <w:r>
+              <w:t>Prep</w:t>
+            </w:r>
+            <w:proofErr w:type="spellEnd"/>
+            <w:r>
+              <w:t>. Medios (Var)</w:t>
+            </w:r>
+          </w:p>
+        </w:tc>
+        <w:tc>
+          <w:tcPr>
+            <w:tcW w:w="0" w:type="auto"/>
+            <w:tcBorders>
+              <w:top w:val="single" w:sz="6" w:space="0" w:color="auto"/>
+              <w:left w:val="single" w:sz="6" w:space="0" w:color="auto"/>
+              <w:bottom w:val="single" w:sz="6" w:space="0" w:color="auto"/>
+              <w:right w:val="single" w:sz="6" w:space="0" w:color="auto"/>
+            </w:tcBorders>
+            <w:vAlign w:val="center"/>
+            <w:hideMark/>
+          </w:tcPr>
+          <w:p>
+            <w:r>
+              <w:t>IT-SOP-01 (Filtración)</w:t>
+            </w:r>
+          </w:p>
+        </w:tc>
+        <w:tc>
+          <w:tcPr>
+            <w:tcW w:w="0" w:type="auto"/>
+            <w:tcBorders>
+              <w:top w:val="single" w:sz="6" w:space="0" w:color="auto"/>
+              <w:left w:val="single" w:sz="6" w:space="0" w:color="auto"/>
+              <w:bottom w:val="single" w:sz="6" w:space="0" w:color="auto"/>
+              <w:right w:val="single" w:sz="6" w:space="0" w:color="auto"/>
+            </w:tcBorders>
+            <w:vAlign w:val="center"/>
+            <w:hideMark/>
+          </w:tcPr>
+          <w:p>
+            <w:r>
+              <w:rPr>
+                <w:b/>
+                <w:bCs/>
+              </w:rPr>
+              <w:t>Variante:</w:t>
+            </w:r>
+            <w:r>
+              <w:t xml:space="preserve"> Registro específico para procesos que requieren filtración estéril/autoclave.</w:t>
+            </w:r>
+          </w:p>
+        </w:tc>
+      </w:tr>
+      <w:tr>
+        <w:trPr>
+          <w:tblCellSpacing w:w="15" w:type="dxa"/>
+        </w:trPr>
+        <w:tc>
+          <w:tcPr>
+            <w:tcW w:w="0" w:type="auto"/>
+            <w:tcBorders>
+              <w:top w:val="single" w:sz="6" w:space="0" w:color="auto"/>
+              <w:left w:val="single" w:sz="6" w:space="0" w:color="auto"/>
+              <w:bottom w:val="single" w:sz="6" w:space="0" w:color="auto"/>
+              <w:right w:val="single" w:sz="6" w:space="0" w:color="auto"/>
+            </w:tcBorders>
+            <w:vAlign w:val="center"/>
+            <w:hideMark/>
+          </w:tcPr>
+          <w:p/>
+        </w:tc>
+        <w:tc>
+          <w:tcPr>
+            <w:tcW w:w="0" w:type="auto"/>
+            <w:tcBorders>
+              <w:top w:val="single" w:sz="6" w:space="0" w:color="auto"/>
+              <w:left w:val="single" w:sz="6" w:space="0" w:color="auto"/>
+              <w:bottom w:val="single" w:sz="6" w:space="0" w:color="auto"/>
+              <w:right w:val="single" w:sz="6" w:space="0" w:color="auto"/>
+            </w:tcBorders>
+            <w:vAlign w:val="center"/>
+            <w:hideMark/>
+          </w:tcPr>
+          <w:p>
+            <w:r>
+              <w:rPr>
+                <w:b/>
+                <w:bCs/>
+              </w:rPr>
+              <w:t>FO-LC-25</w:t>
+            </w:r>
+          </w:p>
+        </w:tc>
+        <w:tc>
+          <w:tcPr>
+            <w:tcW w:w="0" w:type="auto"/>
+            <w:tcBorders>
+              <w:top w:val="single" w:sz="6" w:space="0" w:color="auto"/>
+              <w:left w:val="single" w:sz="6" w:space="0" w:color="auto"/>
+              <w:bottom w:val="single" w:sz="6" w:space="0" w:color="auto"/>
+              <w:right w:val="single" w:sz="6" w:space="0" w:color="auto"/>
+            </w:tcBorders>
+            <w:vAlign w:val="center"/>
+            <w:hideMark/>
+          </w:tcPr>
+          <w:p>
+            <w:r>
+              <w:t>Bitácora Medios</w:t>
+            </w:r>
+          </w:p>
+        </w:tc>
+        <w:tc>
+          <w:tcPr>
+            <w:tcW w:w="0" w:type="auto"/>
+            <w:tcBorders>
+              <w:top w:val="single" w:sz="6" w:space="0" w:color="auto"/>
+              <w:left w:val="single" w:sz="6" w:space="0" w:color="auto"/>
+              <w:bottom w:val="single" w:sz="6" w:space="0" w:color="auto"/>
+              <w:right w:val="single" w:sz="6" w:space="0" w:color="auto"/>
+            </w:tcBorders>
+            <w:vAlign w:val="center"/>
+            <w:hideMark/>
+          </w:tcPr>
+          <w:p>
+            <w:r>
+              <w:t>IT-SOP-02 (Uso Diario)</w:t>
+            </w:r>
+          </w:p>
+        </w:tc>
+        <w:tc>
+          <w:tcPr>
+            <w:tcW w:w="0" w:type="auto"/>
+            <w:tcBorders>
+              <w:top w:val="single" w:sz="6" w:space="0" w:color="auto"/>
+              <w:left w:val="single" w:sz="6" w:space="0" w:color="auto"/>
+              <w:bottom w:val="single" w:sz="6" w:space="0" w:color="auto"/>
+              <w:right w:val="single" w:sz="6" w:space="0" w:color="auto"/>
+            </w:tcBorders>
+            <w:vAlign w:val="center"/>
+            <w:hideMark/>
+          </w:tcPr>
+          <w:p>
+            <w:r>
+              <w:rPr>
+                <w:b/>
+                <w:bCs/>
+              </w:rPr>
+              <w:t>Control:</w:t>
+            </w:r>
+            <w:r>
+              <w:t xml:space="preserve"> Registro rápido de consumo diario de medios preparados en planta.</w:t>
+            </w:r>
+          </w:p>
+        </w:tc>
+      </w:tr>
+      <w:tr>
+        <w:trPr>
+          <w:tblCellSpacing w:w="15" w:type="dxa"/>
+        </w:trPr>
+        <w:tc>
+          <w:tcPr>
+            <w:tcW w:w="0" w:type="auto"/>
+            <w:tcBorders>
+              <w:top w:val="single" w:sz="6" w:space="0" w:color="auto"/>
+              <w:left w:val="single" w:sz="6" w:space="0" w:color="auto"/>
+              <w:bottom w:val="single" w:sz="6" w:space="0" w:color="auto"/>
+              <w:right w:val="single" w:sz="6" w:space="0" w:color="auto"/>
+            </w:tcBorders>
+            <w:vAlign w:val="center"/>
+            <w:hideMark/>
+          </w:tcPr>
+          <w:p>
+            <w:r>
+              <w:rPr>
+                <w:b/>
+                <w:bCs/>
+              </w:rPr>
+              <w:t>4. BANCO / CRIO</w:t>
+            </w:r>
+          </w:p>
+        </w:tc>
+        <w:tc>
+          <w:tcPr>
+            <w:tcW w:w="0" w:type="auto"/>
+            <w:tcBorders>
+              <w:top w:val="single" w:sz="6" w:space="0" w:color="auto"/>
+              <w:left w:val="single" w:sz="6" w:space="0" w:color="auto"/>
+              <w:bottom w:val="single" w:sz="6" w:space="0" w:color="auto"/>
+              <w:right w:val="single" w:sz="6" w:space="0" w:color="auto"/>
+            </w:tcBorders>
+            <w:vAlign w:val="center"/>
+            <w:hideMark/>
+          </w:tcPr>
+          <w:p>
+            <w:r>
+              <w:rPr>
+                <w:b/>
+                <w:bCs/>
+              </w:rPr>
+              <w:t>FO-LC-22</w:t>
+            </w:r>
+          </w:p>
+        </w:tc>
+        <w:tc>
+          <w:tcPr>
+            <w:tcW w:w="0" w:type="auto"/>
+            <w:tcBorders>
+              <w:top w:val="single" w:sz="6" w:space="0" w:color="auto"/>
+              <w:left w:val="single" w:sz="6" w:space="0" w:color="auto"/>
+              <w:bottom w:val="single" w:sz="6" w:space="0" w:color="auto"/>
+              <w:right w:val="single" w:sz="6" w:space="0" w:color="auto"/>
+            </w:tcBorders>
+            <w:vAlign w:val="center"/>
+            <w:hideMark/>
+          </w:tcPr>
+          <w:p>
+            <w:r>
+              <w:t>Crio Banco</w:t>
+            </w:r>
+          </w:p>
+        </w:tc>
+        <w:tc>
+          <w:tcPr>
+            <w:tcW w:w="0" w:type="auto"/>
+            <w:tcBorders>
+              <w:top w:val="single" w:sz="6" w:space="0" w:color="auto"/>
+              <w:left w:val="single" w:sz="6" w:space="0" w:color="auto"/>
+              <w:bottom w:val="single" w:sz="6" w:space="0" w:color="auto"/>
+              <w:right w:val="single" w:sz="6" w:space="0" w:color="auto"/>
+            </w:tcBorders>
+            <w:vAlign w:val="center"/>
+            <w:hideMark/>
+          </w:tcPr>
+          <w:p>
+            <w:r>
+              <w:t>IT-BCO-01 (Mapa Criogénico)</w:t>
+            </w:r>
+          </w:p>
+        </w:tc>
+        <w:tc>
+          <w:tcPr>
+            <w:tcW w:w="0" w:type="auto"/>
+            <w:tcBorders>
+              <w:top w:val="single" w:sz="6" w:space="0" w:color="auto"/>
+              <w:left w:val="single" w:sz="6" w:space="0" w:color="auto"/>
+              <w:bottom w:val="single" w:sz="6" w:space="0" w:color="auto"/>
+              <w:right w:val="single" w:sz="6" w:space="0" w:color="auto"/>
+            </w:tcBorders>
+            <w:vAlign w:val="center"/>
+            <w:hideMark/>
+          </w:tcPr>
+          <w:p>
+            <w:r>
+              <w:rPr>
+                <w:b/>
+                <w:bCs/>
+              </w:rPr>
+              <w:t>Visual:</w:t>
+            </w:r>
+            <w:r>
+              <w:t xml:space="preserve"> Interfaz gráfica (</w:t>
+            </w:r>
+            <w:proofErr w:type="spellStart"/>
+            <w:r>
+              <w:t>Grid</w:t>
+            </w:r>
+            <w:proofErr w:type="spellEnd"/>
+            <w:r>
+              <w:t xml:space="preserve"> 10x10) para gestión de ubicación por colores/pases.</w:t>
+            </w:r>
+          </w:p>
+        </w:tc>
+      </w:tr>
+      <w:tr>
+        <w:trPr>
+          <w:tblCellSpacing w:w="15" w:type="dxa"/>
+        </w:trPr>
+        <w:tc>
+          <w:tcPr>
+            <w:tcW w:w="0" w:type="auto"/>
+            <w:tcBorders>
+              <w:top w:val="single" w:sz="6" w:space="0" w:color="auto"/>
+              <w:left w:val="single" w:sz="6" w:space="0" w:color="auto"/>
+              <w:bottom w:val="single" w:sz="6" w:space="0" w:color="auto"/>
+              <w:right w:val="single" w:sz="6" w:space="0" w:color="auto"/>
+            </w:tcBorders>
+            <w:vAlign w:val="center"/>
+            <w:hideMark/>
+          </w:tcPr>
+          <w:p/>
+        </w:tc>
+        <w:tc>
+          <w:tcPr>
+            <w:tcW w:w="0" w:type="auto"/>
+            <w:tcBorders>
+              <w:top w:val="single" w:sz="6" w:space="0" w:color="auto"/>
+              <w:left w:val="single" w:sz="6" w:space="0" w:color="auto"/>
+              <w:bottom w:val="single" w:sz="6" w:space="0" w:color="auto"/>
+              <w:right w:val="single" w:sz="6" w:space="0" w:color="auto"/>
+            </w:tcBorders>
+            <w:vAlign w:val="center"/>
+            <w:hideMark/>
+          </w:tcPr>
+          <w:p>
+            <w:r>
+              <w:rPr>
+                <w:b/>
+                <w:bCs/>
+              </w:rPr>
+              <w:t>FO-LC-23</w:t>
+            </w:r>
+          </w:p>
+        </w:tc>
+        <w:tc>
+          <w:tcPr>
+            <w:tcW w:w="0" w:type="auto"/>
+            <w:tcBorders>
+              <w:top w:val="single" w:sz="6" w:space="0" w:color="auto"/>
+              <w:left w:val="single" w:sz="6" w:space="0" w:color="auto"/>
+              <w:bottom w:val="single" w:sz="6" w:space="0" w:color="auto"/>
+              <w:right w:val="single" w:sz="6" w:space="0" w:color="auto"/>
+            </w:tcBorders>
+            <w:vAlign w:val="center"/>
+            <w:hideMark/>
+          </w:tcPr>
+          <w:p>
+            <w:r>
+              <w:t>Bitácora Crio</w:t>
+            </w:r>
+          </w:p>
+        </w:tc>
+        <w:tc>
+          <w:tcPr>
+            <w:tcW w:w="0" w:type="auto"/>
+            <w:tcBorders>
+              <w:top w:val="single" w:sz="6" w:space="0" w:color="auto"/>
+              <w:left w:val="single" w:sz="6" w:space="0" w:color="auto"/>
+              <w:bottom w:val="single" w:sz="6" w:space="0" w:color="auto"/>
+              <w:right w:val="single" w:sz="6" w:space="0" w:color="auto"/>
+            </w:tcBorders>
+            <w:vAlign w:val="center"/>
+            <w:hideMark/>
+          </w:tcPr>
+          <w:p>
+            <w:r>
+              <w:t>PR-BCO-02 (Gestión Inventario)</w:t>
+            </w:r>
+          </w:p>
+        </w:tc>
+        <w:tc>
+          <w:tcPr>
+            <w:tcW w:w="0" w:type="auto"/>
+            <w:tcBorders>
+              <w:top w:val="single" w:sz="6" w:space="0" w:color="auto"/>
+              <w:left w:val="single" w:sz="6" w:space="0" w:color="auto"/>
+              <w:bottom w:val="single" w:sz="6" w:space="0" w:color="auto"/>
+              <w:right w:val="single" w:sz="6" w:space="0" w:color="auto"/>
+            </w:tcBorders>
+            <w:vAlign w:val="center"/>
+            <w:hideMark/>
+          </w:tcPr>
+          <w:p>
+            <w:r>
+              <w:rPr>
+                <w:b/>
+                <w:bCs/>
+              </w:rPr>
+              <w:t>Inventario:</w:t>
+            </w:r>
+            <w:r>
+              <w:t xml:space="preserve"> Control estricto de entradas/salidas del tanque de nitrógeno (FIFO).</w:t>
+            </w:r>
+          </w:p>
+        </w:tc>
+      </w:tr>
+      <w:tr>
+        <w:trPr>
+          <w:tblCellSpacing w:w="15" w:type="dxa"/>
+        </w:trPr>
+        <w:tc>
+          <w:tcPr>
+            <w:tcW w:w="0" w:type="auto"/>
+            <w:tcBorders>
+              <w:top w:val="single" w:sz="6" w:space="0" w:color="auto"/>
+              <w:left w:val="single" w:sz="6" w:space="0" w:color="auto"/>
+              <w:bottom w:val="single" w:sz="6" w:space="0" w:color="auto"/>
+              <w:right w:val="single" w:sz="6" w:space="0" w:color="auto"/>
+            </w:tcBorders>
+            <w:vAlign w:val="center"/>
+            <w:hideMark/>
+          </w:tcPr>
+          <w:p>
+            <w:r>
+              <w:rPr>
+                <w:b/>
+                <w:bCs/>
+              </w:rPr>
+              <w:t>5. PRODUCTO</w:t>
+            </w:r>
+          </w:p>
+        </w:tc>
+        <w:tc>
+          <w:tcPr>
+            <w:tcW w:w="0" w:type="auto"/>
+            <w:tcBorders>
+              <w:top w:val="single" w:sz="6" w:space="0" w:color="auto"/>
+              <w:left w:val="single" w:sz="6" w:space="0" w:color="auto"/>
+              <w:bottom w:val="single" w:sz="6" w:space="0" w:color="auto"/>
+              <w:right w:val="single" w:sz="6" w:space="0" w:color="auto"/>
+            </w:tcBorders>
+            <w:vAlign w:val="center"/>
+            <w:hideMark/>
+          </w:tcPr>
+          <w:p>
+            <w:r>
+              <w:rPr>
+                <w:b/>
+                <w:bCs/>
+              </w:rPr>
+              <w:t>FO-LC-29</w:t>
+            </w:r>
+          </w:p>
+        </w:tc>
+        <w:tc>
+          <w:tcPr>
+            <w:tcW w:w="0" w:type="auto"/>
+            <w:tcBorders>
+              <w:top w:val="single" w:sz="6" w:space="0" w:color="auto"/>
+              <w:left w:val="single" w:sz="6" w:space="0" w:color="auto"/>
+              <w:bottom w:val="single" w:sz="6" w:space="0" w:color="auto"/>
+              <w:right w:val="single" w:sz="6" w:space="0" w:color="auto"/>
+            </w:tcBorders>
+            <w:vAlign w:val="center"/>
+            <w:hideMark/>
+          </w:tcPr>
+          <w:p>
+            <w:r>
+              <w:t>Lote Celular</w:t>
+            </w:r>
+          </w:p>
+        </w:tc>
+        <w:tc>
+          <w:tcPr>
+            <w:tcW w:w="0" w:type="auto"/>
+            <w:tcBorders>
+              <w:top w:val="single" w:sz="6" w:space="0" w:color="auto"/>
+              <w:left w:val="single" w:sz="6" w:space="0" w:color="auto"/>
+              <w:bottom w:val="single" w:sz="6" w:space="0" w:color="auto"/>
+              <w:right w:val="single" w:sz="6" w:space="0" w:color="auto"/>
+            </w:tcBorders>
+            <w:vAlign w:val="center"/>
+            <w:hideMark/>
+          </w:tcPr>
+          <w:p>
+            <w:r>
+              <w:t>PR-PRO-03 (</w:t>
+            </w:r>
+            <w:proofErr w:type="spellStart"/>
+            <w:r>
+              <w:t>Prod</w:t>
+            </w:r>
+            <w:proofErr w:type="spellEnd"/>
+            <w:r>
+              <w:t>. Terminado Celular)</w:t>
+            </w:r>
+          </w:p>
+        </w:tc>
+        <w:tc>
+          <w:tcPr>
+            <w:tcW w:w="0" w:type="auto"/>
+            <w:tcBorders>
+              <w:top w:val="single" w:sz="6" w:space="0" w:color="auto"/>
+              <w:left w:val="single" w:sz="6" w:space="0" w:color="auto"/>
+              <w:bottom w:val="single" w:sz="6" w:space="0" w:color="auto"/>
+              <w:right w:val="single" w:sz="6" w:space="0" w:color="auto"/>
+            </w:tcBorders>
+            <w:vAlign w:val="center"/>
+            <w:hideMark/>
+          </w:tcPr>
+          <w:p>
+            <w:r>
+              <w:rPr>
+                <w:b/>
+                <w:bCs/>
+              </w:rPr>
+              <w:t>Conversión:</w:t>
+            </w:r>
+            <w:r>
+              <w:t xml:space="preserve"> Cosecha -&gt; Producto Final (Stem/Hybrid). Calcula caducidad corta (+4 días).</w:t>
+            </w:r>
+          </w:p>
+        </w:tc>
+      </w:tr>
+      <w:tr>
+        <w:trPr>
+          <w:tblCellSpacing w:w="15" w:type="dxa"/>
+        </w:trPr>
+        <w:tc>
+          <w:tcPr>
+            <w:tcW w:w="0" w:type="auto"/>
+            <w:tcBorders>
+              <w:top w:val="single" w:sz="6" w:space="0" w:color="auto"/>
+              <w:left w:val="single" w:sz="6" w:space="0" w:color="auto"/>
+              <w:bottom w:val="single" w:sz="6" w:space="0" w:color="auto"/>
+              <w:right w:val="single" w:sz="6" w:space="0" w:color="auto"/>
+            </w:tcBorders>
+            <w:vAlign w:val="center"/>
+            <w:hideMark/>
+          </w:tcPr>
+          <w:p/>
+        </w:tc>
+        <w:tc>
+          <w:tcPr>
+            <w:tcW w:w="0" w:type="auto"/>
+            <w:tcBorders>
+              <w:top w:val="single" w:sz="6" w:space="0" w:color="auto"/>
+              <w:left w:val="single" w:sz="6" w:space="0" w:color="auto"/>
+              <w:bottom w:val="single" w:sz="6" w:space="0" w:color="auto"/>
+              <w:right w:val="single" w:sz="6" w:space="0" w:color="auto"/>
+            </w:tcBorders>
+            <w:vAlign w:val="center"/>
+            <w:hideMark/>
+          </w:tcPr>
+          <w:p>
+            <w:r>
+              <w:rPr>
+                <w:b/>
+                <w:bCs/>
+              </w:rPr>
+              <w:t>FO-LC-30</w:t>
+            </w:r>
+          </w:p>
+        </w:tc>
+        <w:tc>
+          <w:tcPr>
+            <w:tcW w:w="0" w:type="auto"/>
+            <w:tcBorders>
+              <w:top w:val="single" w:sz="6" w:space="0" w:color="auto"/>
+              <w:left w:val="single" w:sz="6" w:space="0" w:color="auto"/>
+              <w:bottom w:val="single" w:sz="6" w:space="0" w:color="auto"/>
+              <w:right w:val="single" w:sz="6" w:space="0" w:color="auto"/>
+            </w:tcBorders>
+            <w:vAlign w:val="center"/>
+            <w:hideMark/>
+          </w:tcPr>
+          <w:p>
+            <w:r>
+              <w:t>Lote Acelular</w:t>
+            </w:r>
+          </w:p>
+        </w:tc>
+        <w:tc>
+          <w:tcPr>
+            <w:tcW w:w="0" w:type="auto"/>
+            <w:tcBorders>
+              <w:top w:val="single" w:sz="6" w:space="0" w:color="auto"/>
+              <w:left w:val="single" w:sz="6" w:space="0" w:color="auto"/>
+              <w:bottom w:val="single" w:sz="6" w:space="0" w:color="auto"/>
+              <w:right w:val="single" w:sz="6" w:space="0" w:color="auto"/>
+            </w:tcBorders>
+            <w:vAlign w:val="center"/>
+            <w:hideMark/>
+          </w:tcPr>
+          <w:p>
+            <w:r>
+              <w:t>PR-PRO-04 (</w:t>
+            </w:r>
+            <w:proofErr w:type="spellStart"/>
+            <w:r>
+              <w:t>Prod</w:t>
+            </w:r>
+            <w:proofErr w:type="spellEnd"/>
+            <w:r>
+              <w:t>. Acelular)</w:t>
+            </w:r>
+          </w:p>
+        </w:tc>
+        <w:tc>
+          <w:tcPr>
+            <w:tcW w:w="0" w:type="auto"/>
+            <w:tcBorders>
+              <w:top w:val="single" w:sz="6" w:space="0" w:color="auto"/>
+              <w:left w:val="single" w:sz="6" w:space="0" w:color="auto"/>
+              <w:bottom w:val="single" w:sz="6" w:space="0" w:color="auto"/>
+              <w:right w:val="single" w:sz="6" w:space="0" w:color="auto"/>
+            </w:tcBorders>
+            <w:vAlign w:val="center"/>
+            <w:hideMark/>
+          </w:tcPr>
+          <w:p>
+            <w:r>
+              <w:rPr>
+                <w:b/>
+                <w:bCs/>
+              </w:rPr>
+              <w:t>Conversión:</w:t>
+            </w:r>
+            <w:r>
+              <w:t xml:space="preserve"> Para productos estables (Exosomas). Calcula caducidad larga (1-2 años).</w:t>
+            </w:r>
+          </w:p>
+        </w:tc>
+      </w:tr>
+      <w:tr>
+        <w:trPr>
+          <w:tblCellSpacing w:w="15" w:type="dxa"/>
+        </w:trPr>
+        <w:tc>
+          <w:tcPr>
+            <w:tcW w:w="0" w:type="auto"/>
+            <w:tcBorders>
+              <w:top w:val="single" w:sz="6" w:space="0" w:color="auto"/>
+              <w:left w:val="single" w:sz="6" w:space="0" w:color="auto"/>
+              <w:bottom w:val="single" w:sz="6" w:space="0" w:color="auto"/>
+              <w:right w:val="single" w:sz="6" w:space="0" w:color="auto"/>
+            </w:tcBorders>
+            <w:vAlign w:val="center"/>
+            <w:hideMark/>
+          </w:tcPr>
+          <w:p/>
+        </w:tc>
+        <w:tc>
+          <w:tcPr>
+            <w:tcW w:w="0" w:type="auto"/>
+            <w:tcBorders>
+              <w:top w:val="single" w:sz="6" w:space="0" w:color="auto"/>
+              <w:left w:val="single" w:sz="6" w:space="0" w:color="auto"/>
+              <w:bottom w:val="single" w:sz="6" w:space="0" w:color="auto"/>
+              <w:right w:val="single" w:sz="6" w:space="0" w:color="auto"/>
+            </w:tcBorders>
+            <w:vAlign w:val="center"/>
+            <w:hideMark/>
+          </w:tcPr>
+          <w:p>
+            <w:r>
+              <w:rPr>
+                <w:b/>
+                <w:bCs/>
+              </w:rPr>
+              <w:t>FO-LC-31</w:t>
+            </w:r>
+          </w:p>
+        </w:tc>
+        <w:tc>
+          <w:tcPr>
+            <w:tcW w:w="0" w:type="auto"/>
+            <w:tcBorders>
+              <w:top w:val="single" w:sz="6" w:space="0" w:color="auto"/>
+              <w:left w:val="single" w:sz="6" w:space="0" w:color="auto"/>
+              <w:bottom w:val="single" w:sz="6" w:space="0" w:color="auto"/>
+              <w:right w:val="single" w:sz="6" w:space="0" w:color="auto"/>
+            </w:tcBorders>
+            <w:vAlign w:val="center"/>
+            <w:hideMark/>
+          </w:tcPr>
+          <w:p>
+            <w:r>
+              <w:t>Registro Lote</w:t>
+            </w:r>
+          </w:p>
+        </w:tc>
+        <w:tc>
+          <w:tcPr>
+            <w:tcW w:w="0" w:type="auto"/>
+            <w:tcBorders>
+              <w:top w:val="single" w:sz="6" w:space="0" w:color="auto"/>
+              <w:left w:val="single" w:sz="6" w:space="0" w:color="auto"/>
+              <w:bottom w:val="single" w:sz="6" w:space="0" w:color="auto"/>
+              <w:right w:val="single" w:sz="6" w:space="0" w:color="auto"/>
+            </w:tcBorders>
+            <w:vAlign w:val="center"/>
+            <w:hideMark/>
+          </w:tcPr>
+          <w:p>
+            <w:r>
+              <w:t>IT-PRO-08 (Acondicionamiento)</w:t>
+            </w:r>
+          </w:p>
+        </w:tc>
+        <w:tc>
+          <w:tcPr>
+            <w:tcW w:w="0" w:type="auto"/>
+            <w:tcBorders>
+              <w:top w:val="single" w:sz="6" w:space="0" w:color="auto"/>
+              <w:left w:val="single" w:sz="6" w:space="0" w:color="auto"/>
+              <w:bottom w:val="single" w:sz="6" w:space="0" w:color="auto"/>
+              <w:right w:val="single" w:sz="6" w:space="0" w:color="auto"/>
+            </w:tcBorders>
+            <w:vAlign w:val="center"/>
+            <w:hideMark/>
+          </w:tcPr>
+          <w:p>
+            <w:r>
+              <w:rPr>
+                <w:b/>
+                <w:bCs/>
+              </w:rPr>
+              <w:t>Empaque:</w:t>
+            </w:r>
+            <w:r>
+              <w:t xml:space="preserve"> Registro del proceso de etiquetado y envase secundario/terciario.</w:t>
+            </w:r>
+          </w:p>
+        </w:tc>
+      </w:tr>
+      <w:tr>
+        <w:trPr>
+          <w:tblCellSpacing w:w="15" w:type="dxa"/>
+        </w:trPr>
+        <w:tc>
+          <w:tcPr>
+            <w:tcW w:w="0" w:type="auto"/>
+            <w:tcBorders>
+              <w:top w:val="single" w:sz="6" w:space="0" w:color="auto"/>
+              <w:left w:val="single" w:sz="6" w:space="0" w:color="auto"/>
+              <w:bottom w:val="single" w:sz="6" w:space="0" w:color="auto"/>
+              <w:right w:val="single" w:sz="6" w:space="0" w:color="auto"/>
+            </w:tcBorders>
+            <w:vAlign w:val="center"/>
+            <w:hideMark/>
+          </w:tcPr>
+          <w:p/>
+        </w:tc>
+        <w:tc>
+          <w:tcPr>
+            <w:tcW w:w="0" w:type="auto"/>
+            <w:tcBorders>
+              <w:top w:val="single" w:sz="6" w:space="0" w:color="auto"/>
+              <w:left w:val="single" w:sz="6" w:space="0" w:color="auto"/>
+              <w:bottom w:val="single" w:sz="6" w:space="0" w:color="auto"/>
+              <w:right w:val="single" w:sz="6" w:space="0" w:color="auto"/>
+            </w:tcBorders>
+            <w:vAlign w:val="center"/>
+            <w:hideMark/>
+          </w:tcPr>
+          <w:p>
+            <w:r>
+              <w:rPr>
+                <w:b/>
+                <w:bCs/>
+              </w:rPr>
+              <w:t>FO-LC-42</w:t>
+            </w:r>
+          </w:p>
+        </w:tc>
+        <w:tc>
+          <w:tcPr>
+            <w:tcW w:w="0" w:type="auto"/>
+            <w:tcBorders>
+              <w:top w:val="single" w:sz="6" w:space="0" w:color="auto"/>
+              <w:left w:val="single" w:sz="6" w:space="0" w:color="auto"/>
+              <w:bottom w:val="single" w:sz="6" w:space="0" w:color="auto"/>
+              <w:right w:val="single" w:sz="6" w:space="0" w:color="auto"/>
+            </w:tcBorders>
+            <w:vAlign w:val="center"/>
+            <w:hideMark/>
+          </w:tcPr>
+          <w:p>
+            <w:r>
+              <w:t>Liofilización Placenta</w:t>
+            </w:r>
+          </w:p>
+        </w:tc>
+        <w:tc>
+          <w:tcPr>
+            <w:tcW w:w="0" w:type="auto"/>
+            <w:tcBorders>
+              <w:top w:val="single" w:sz="6" w:space="0" w:color="auto"/>
+              <w:left w:val="single" w:sz="6" w:space="0" w:color="auto"/>
+              <w:bottom w:val="single" w:sz="6" w:space="0" w:color="auto"/>
+              <w:right w:val="single" w:sz="6" w:space="0" w:color="auto"/>
+            </w:tcBorders>
+            <w:vAlign w:val="center"/>
+            <w:hideMark/>
+          </w:tcPr>
+          <w:p>
+            <w:r>
+              <w:t>IT-PRO-09 (Liofilización)</w:t>
+            </w:r>
+          </w:p>
+        </w:tc>
+        <w:tc>
+          <w:tcPr>
+            <w:tcW w:w="0" w:type="auto"/>
+            <w:tcBorders>
+              <w:top w:val="single" w:sz="6" w:space="0" w:color="auto"/>
+              <w:left w:val="single" w:sz="6" w:space="0" w:color="auto"/>
+              <w:bottom w:val="single" w:sz="6" w:space="0" w:color="auto"/>
+              <w:right w:val="single" w:sz="6" w:space="0" w:color="auto"/>
+            </w:tcBorders>
+            <w:vAlign w:val="center"/>
+            <w:hideMark/>
+          </w:tcPr>
+          <w:p>
+            <w:r>
+              <w:rPr>
+                <w:b/>
+                <w:bCs/>
+              </w:rPr>
+              <w:t>Proceso Especial:</w:t>
+            </w:r>
+            <w:r>
+              <w:t xml:space="preserve"> Bitácora de parámetros críticos (Vacío, Temp) para polvo de placenta.</w:t>
+            </w:r>
+          </w:p>
+        </w:tc>
+      </w:tr>
+      <w:tr>
+        <w:trPr>
+          <w:tblCellSpacing w:w="15" w:type="dxa"/>
+        </w:trPr>
+        <w:tc>
+          <w:tcPr>
+            <w:tcW w:w="0" w:type="auto"/>
+            <w:tcBorders>
+              <w:top w:val="single" w:sz="6" w:space="0" w:color="auto"/>
+              <w:left w:val="single" w:sz="6" w:space="0" w:color="auto"/>
+              <w:bottom w:val="single" w:sz="6" w:space="0" w:color="auto"/>
+              <w:right w:val="single" w:sz="6" w:space="0" w:color="auto"/>
+            </w:tcBorders>
+            <w:vAlign w:val="center"/>
+            <w:hideMark/>
+          </w:tcPr>
+          <w:p/>
+        </w:tc>
+        <w:tc>
+          <w:tcPr>
+            <w:tcW w:w="0" w:type="auto"/>
+            <w:tcBorders>
+              <w:top w:val="single" w:sz="6" w:space="0" w:color="auto"/>
+              <w:left w:val="single" w:sz="6" w:space="0" w:color="auto"/>
+              <w:bottom w:val="single" w:sz="6" w:space="0" w:color="auto"/>
+              <w:right w:val="single" w:sz="6" w:space="0" w:color="auto"/>
+            </w:tcBorders>
+            <w:vAlign w:val="center"/>
+            <w:hideMark/>
+          </w:tcPr>
+          <w:p>
+            <w:r>
+              <w:rPr>
+                <w:b/>
+                <w:bCs/>
+              </w:rPr>
+              <w:t>FO-LC-43</w:t>
+            </w:r>
+          </w:p>
+        </w:tc>
+        <w:tc>
+          <w:tcPr>
+            <w:tcW w:w="0" w:type="auto"/>
+            <w:tcBorders>
+              <w:top w:val="single" w:sz="6" w:space="0" w:color="auto"/>
+              <w:left w:val="single" w:sz="6" w:space="0" w:color="auto"/>
+              <w:bottom w:val="single" w:sz="6" w:space="0" w:color="auto"/>
+              <w:right w:val="single" w:sz="6" w:space="0" w:color="auto"/>
+            </w:tcBorders>
+            <w:vAlign w:val="center"/>
+            <w:hideMark/>
+          </w:tcPr>
+          <w:p>
+            <w:r>
+              <w:t>Liofilización MC</w:t>
+            </w:r>
+          </w:p>
+        </w:tc>
+        <w:tc>
+          <w:tcPr>
+            <w:tcW w:w="0" w:type="auto"/>
+            <w:tcBorders>
+              <w:top w:val="single" w:sz="6" w:space="0" w:color="auto"/>
+              <w:left w:val="single" w:sz="6" w:space="0" w:color="auto"/>
+              <w:bottom w:val="single" w:sz="6" w:space="0" w:color="auto"/>
+              <w:right w:val="single" w:sz="6" w:space="0" w:color="auto"/>
+            </w:tcBorders>
+            <w:vAlign w:val="center"/>
+            <w:hideMark/>
+          </w:tcPr>
+          <w:p>
+            <w:r>
+              <w:t>IT-PRO-10 (</w:t>
+            </w:r>
+            <w:proofErr w:type="spellStart"/>
+            <w:r>
+              <w:t>Liof</w:t>
+            </w:r>
+            <w:proofErr w:type="spellEnd"/>
+            <w:r>
+              <w:t>. Medios)</w:t>
+            </w:r>
+          </w:p>
+        </w:tc>
+        <w:tc>
+          <w:tcPr>
+            <w:tcW w:w="0" w:type="auto"/>
+            <w:tcBorders>
+              <w:top w:val="single" w:sz="6" w:space="0" w:color="auto"/>
+              <w:left w:val="single" w:sz="6" w:space="0" w:color="auto"/>
+              <w:bottom w:val="single" w:sz="6" w:space="0" w:color="auto"/>
+              <w:right w:val="single" w:sz="6" w:space="0" w:color="auto"/>
+            </w:tcBorders>
+            <w:vAlign w:val="center"/>
+            <w:hideMark/>
+          </w:tcPr>
+          <w:p>
+            <w:r>
+              <w:rPr>
+                <w:b/>
+                <w:bCs/>
+              </w:rPr>
+              <w:t>Proceso Especial:</w:t>
+            </w:r>
+            <w:r>
+              <w:t xml:space="preserve"> Transformación de Medios Condicionados líquidos a polvo estable.</w:t>
+            </w:r>
+          </w:p>
+        </w:tc>
+      </w:tr>
+      <w:tr>
+        <w:trPr>
+          <w:tblCellSpacing w:w="15" w:type="dxa"/>
+        </w:trPr>
+        <w:tc>
+          <w:tcPr>
+            <w:tcW w:w="0" w:type="auto"/>
+            <w:tcBorders>
+              <w:top w:val="single" w:sz="6" w:space="0" w:color="auto"/>
+              <w:left w:val="single" w:sz="6" w:space="0" w:color="auto"/>
+              <w:bottom w:val="single" w:sz="6" w:space="0" w:color="auto"/>
+              <w:right w:val="single" w:sz="6" w:space="0" w:color="auto"/>
+            </w:tcBorders>
+            <w:vAlign w:val="center"/>
+            <w:hideMark/>
+          </w:tcPr>
+          <w:p>
+            <w:r>
+              <w:rPr>
+                <w:b/>
+                <w:bCs/>
+              </w:rPr>
+              <w:lastRenderedPageBreak/>
+              <w:t>6. INVENTARIO</w:t>
+            </w:r>
+          </w:p>
+        </w:tc>
+        <w:tc>
+          <w:tcPr>
+            <w:tcW w:w="0" w:type="auto"/>
+            <w:tcBorders>
+              <w:top w:val="single" w:sz="6" w:space="0" w:color="auto"/>
+              <w:left w:val="single" w:sz="6" w:space="0" w:color="auto"/>
+              <w:bottom w:val="single" w:sz="6" w:space="0" w:color="auto"/>
+              <w:right w:val="single" w:sz="6" w:space="0" w:color="auto"/>
+            </w:tcBorders>
+            <w:vAlign w:val="center"/>
+            <w:hideMark/>
+          </w:tcPr>
+          <w:p>
+            <w:r>
+              <w:rPr>
+                <w:b/>
+                <w:bCs/>
+              </w:rPr>
+              <w:t>FO-LC-24</w:t>
+            </w:r>
+          </w:p>
+        </w:tc>
+        <w:tc>
+          <w:tcPr>
+            <w:tcW w:w="0" w:type="auto"/>
+            <w:tcBorders>
+              <w:top w:val="single" w:sz="6" w:space="0" w:color="auto"/>
+              <w:left w:val="single" w:sz="6" w:space="0" w:color="auto"/>
+              <w:bottom w:val="single" w:sz="6" w:space="0" w:color="auto"/>
+              <w:right w:val="single" w:sz="6" w:space="0" w:color="auto"/>
+            </w:tcBorders>
+            <w:vAlign w:val="center"/>
+            <w:hideMark/>
+          </w:tcPr>
+          <w:p>
+            <w:r>
+              <w:t>Dosificación</w:t>
+            </w:r>
+          </w:p>
+        </w:tc>
+        <w:tc>
+          <w:tcPr>
+            <w:tcW w:w="0" w:type="auto"/>
+            <w:tcBorders>
+              <w:top w:val="single" w:sz="6" w:space="0" w:color="auto"/>
+              <w:left w:val="single" w:sz="6" w:space="0" w:color="auto"/>
+              <w:bottom w:val="single" w:sz="6" w:space="0" w:color="auto"/>
+              <w:right w:val="single" w:sz="6" w:space="0" w:color="auto"/>
+            </w:tcBorders>
+            <w:vAlign w:val="center"/>
+            <w:hideMark/>
+          </w:tcPr>
+          <w:p>
+            <w:r>
+              <w:t>PR-LOG-01 (Control Stock)</w:t>
+            </w:r>
+          </w:p>
+        </w:tc>
+        <w:tc>
+          <w:tcPr>
+            <w:tcW w:w="0" w:type="auto"/>
+            <w:tcBorders>
+              <w:top w:val="single" w:sz="6" w:space="0" w:color="auto"/>
+              <w:left w:val="single" w:sz="6" w:space="0" w:color="auto"/>
+              <w:bottom w:val="single" w:sz="6" w:space="0" w:color="auto"/>
+              <w:right w:val="single" w:sz="6" w:space="0" w:color="auto"/>
+            </w:tcBorders>
+            <w:vAlign w:val="center"/>
+            <w:hideMark/>
+          </w:tcPr>
+          <w:p>
+            <w:r>
+              <w:rPr>
+                <w:b/>
+                <w:bCs/>
+              </w:rPr>
+              <w:t>Calculadora:</w:t>
+            </w:r>
+            <w:r>
+              <w:t xml:space="preserve"> Suma viales producidos al Stock Global disponible para el equipo comercial.</w:t>
+            </w:r>
+          </w:p>
+        </w:tc>
+      </w:tr>
+      <w:tr>
+        <w:trPr>
+          <w:tblCellSpacing w:w="15" w:type="dxa"/>
+        </w:trPr>
+        <w:tc>
+          <w:tcPr>
+            <w:tcW w:w="0" w:type="auto"/>
+            <w:tcBorders>
+              <w:top w:val="single" w:sz="6" w:space="0" w:color="auto"/>
+              <w:left w:val="single" w:sz="6" w:space="0" w:color="auto"/>
+              <w:bottom w:val="single" w:sz="6" w:space="0" w:color="auto"/>
+              <w:right w:val="single" w:sz="6" w:space="0" w:color="auto"/>
+            </w:tcBorders>
+            <w:vAlign w:val="center"/>
+            <w:hideMark/>
+          </w:tcPr>
+          <w:p>
+            <w:r>
+              <w:rPr>
+                <w:b/>
+                <w:bCs/>
+              </w:rPr>
+              <w:t>7. SOPORTE</w:t>
+            </w:r>
+          </w:p>
+        </w:tc>
+        <w:tc>
+          <w:tcPr>
+            <w:tcW w:w="0" w:type="auto"/>
+            <w:tcBorders>
+              <w:top w:val="single" w:sz="6" w:space="0" w:color="auto"/>
+              <w:left w:val="single" w:sz="6" w:space="0" w:color="auto"/>
+              <w:bottom w:val="single" w:sz="6" w:space="0" w:color="auto"/>
+              <w:right w:val="single" w:sz="6" w:space="0" w:color="auto"/>
+            </w:tcBorders>
+            <w:vAlign w:val="center"/>
+            <w:hideMark/>
+          </w:tcPr>
+          <w:p>
+            <w:r>
+              <w:rPr>
+                <w:b/>
+                <w:bCs/>
+              </w:rPr>
+              <w:t>FO-LC-26</w:t>
+            </w:r>
+          </w:p>
+        </w:tc>
+        <w:tc>
+          <w:tcPr>
+            <w:tcW w:w="0" w:type="auto"/>
+            <w:tcBorders>
+              <w:top w:val="single" w:sz="6" w:space="0" w:color="auto"/>
+              <w:left w:val="single" w:sz="6" w:space="0" w:color="auto"/>
+              <w:bottom w:val="single" w:sz="6" w:space="0" w:color="auto"/>
+              <w:right w:val="single" w:sz="6" w:space="0" w:color="auto"/>
+            </w:tcBorders>
+            <w:vAlign w:val="center"/>
+            <w:hideMark/>
+          </w:tcPr>
+          <w:p>
+            <w:r>
+              <w:t>Esterilización</w:t>
+            </w:r>
+          </w:p>
+        </w:tc>
+        <w:tc>
+          <w:tcPr>
+            <w:tcW w:w="0" w:type="auto"/>
+            <w:tcBorders>
+              <w:top w:val="single" w:sz="6" w:space="0" w:color="auto"/>
+              <w:left w:val="single" w:sz="6" w:space="0" w:color="auto"/>
+              <w:bottom w:val="single" w:sz="6" w:space="0" w:color="auto"/>
+              <w:right w:val="single" w:sz="6" w:space="0" w:color="auto"/>
+            </w:tcBorders>
+            <w:vAlign w:val="center"/>
+            <w:hideMark/>
+          </w:tcPr>
+          <w:p>
+            <w:r>
+              <w:t>IT-SOP-03 (Esterilización)</w:t>
+            </w:r>
+          </w:p>
+        </w:tc>
+        <w:tc>
+          <w:tcPr>
+            <w:tcW w:w="0" w:type="auto"/>
+            <w:tcBorders>
+              <w:top w:val="single" w:sz="6" w:space="0" w:color="auto"/>
+              <w:left w:val="single" w:sz="6" w:space="0" w:color="auto"/>
+              <w:bottom w:val="single" w:sz="6" w:space="0" w:color="auto"/>
+              <w:right w:val="single" w:sz="6" w:space="0" w:color="auto"/>
+            </w:tcBorders>
+            <w:vAlign w:val="center"/>
+            <w:hideMark/>
+          </w:tcPr>
+          <w:p>
+            <w:r>
+              <w:rPr>
+                <w:b/>
+                <w:bCs/>
+              </w:rPr>
+              <w:t>Validación:</w:t>
+            </w:r>
+            <w:r>
+              <w:t xml:space="preserve"> Bitácora de ciclos de carga de Autoclave/Horno con testigo biológico.</w:t>
+            </w:r>
+          </w:p>
+        </w:tc>
+      </w:tr>
+      <w:tr>
+        <w:trPr>
+          <w:tblCellSpacing w:w="15" w:type="dxa"/>
+        </w:trPr>
+        <w:tc>
+          <w:tcPr>
+            <w:tcW w:w="0" w:type="auto"/>
+            <w:tcBorders>
+              <w:top w:val="single" w:sz="6" w:space="0" w:color="auto"/>
+              <w:left w:val="single" w:sz="6" w:space="0" w:color="auto"/>
+              <w:bottom w:val="single" w:sz="6" w:space="0" w:color="auto"/>
+              <w:right w:val="single" w:sz="6" w:space="0" w:color="auto"/>
+            </w:tcBorders>
+            <w:vAlign w:val="center"/>
+            <w:hideMark/>
+          </w:tcPr>
+          <w:p/>
+        </w:tc>
+        <w:tc>
+          <w:tcPr>
+            <w:tcW w:w="0" w:type="auto"/>
+            <w:tcBorders>
+              <w:top w:val="single" w:sz="6" w:space="0" w:color="auto"/>
+              <w:left w:val="single" w:sz="6" w:space="0" w:color="auto"/>
+              <w:bottom w:val="single" w:sz="6" w:space="0" w:color="auto"/>
+              <w:right w:val="single" w:sz="6" w:space="0" w:color="auto"/>
+            </w:tcBorders>
+            <w:vAlign w:val="center"/>
+            <w:hideMark/>
+          </w:tcPr>
+          <w:p>
+            <w:r>
+              <w:rPr>
+                <w:b/>
+                <w:bCs/>
+              </w:rPr>
+              <w:t>FO-LC-27</w:t>
+            </w:r>
+          </w:p>
+        </w:tc>
+        <w:tc>
+          <w:tcPr>
+            <w:tcW w:w="0" w:type="auto"/>
+            <w:tcBorders>
+              <w:top w:val="single" w:sz="6" w:space="0" w:color="auto"/>
+              <w:left w:val="single" w:sz="6" w:space="0" w:color="auto"/>
+              <w:bottom w:val="single" w:sz="6" w:space="0" w:color="auto"/>
+              <w:right w:val="single" w:sz="6" w:space="0" w:color="auto"/>
+            </w:tcBorders>
+            <w:vAlign w:val="center"/>
+            <w:hideMark/>
+          </w:tcPr>
+          <w:p>
+            <w:r>
+              <w:t>Control Equipos</w:t>
+            </w:r>
+          </w:p>
+        </w:tc>
+        <w:tc>
+          <w:tcPr>
+            <w:tcW w:w="0" w:type="auto"/>
+            <w:tcBorders>
+              <w:top w:val="single" w:sz="6" w:space="0" w:color="auto"/>
+              <w:left w:val="single" w:sz="6" w:space="0" w:color="auto"/>
+              <w:bottom w:val="single" w:sz="6" w:space="0" w:color="auto"/>
+              <w:right w:val="single" w:sz="6" w:space="0" w:color="auto"/>
+            </w:tcBorders>
+            <w:vAlign w:val="center"/>
+            <w:hideMark/>
+          </w:tcPr>
+          <w:p>
+            <w:r>
+              <w:t>PR-MAN-01 (Plan Mantenimiento)</w:t>
+            </w:r>
+          </w:p>
+        </w:tc>
+        <w:tc>
+          <w:tcPr>
+            <w:tcW w:w="0" w:type="auto"/>
+            <w:tcBorders>
+              <w:top w:val="single" w:sz="6" w:space="0" w:color="auto"/>
+              <w:left w:val="single" w:sz="6" w:space="0" w:color="auto"/>
+              <w:bottom w:val="single" w:sz="6" w:space="0" w:color="auto"/>
+              <w:right w:val="single" w:sz="6" w:space="0" w:color="auto"/>
+            </w:tcBorders>
+            <w:vAlign w:val="center"/>
+            <w:hideMark/>
+          </w:tcPr>
+          <w:p>
+            <w:r>
+              <w:rPr>
+                <w:b/>
+                <w:bCs/>
+              </w:rPr>
+              <w:t>Vida Útil:</w:t>
+            </w:r>
+            <w:r>
+              <w:t xml:space="preserve"> Historial de mantenimiento preventivo y correctivo de equipos críticos.</w:t>
+            </w:r>
+          </w:p>
+        </w:tc>
+      </w:tr>
+      <w:tr>
+        <w:trPr>
+          <w:tblCellSpacing w:w="15" w:type="dxa"/>
+        </w:trPr>
+        <w:tc>
+          <w:tcPr>
+            <w:tcW w:w="0" w:type="auto"/>
+            <w:tcBorders>
+              <w:top w:val="single" w:sz="6" w:space="0" w:color="auto"/>
+              <w:left w:val="single" w:sz="6" w:space="0" w:color="auto"/>
+              <w:bottom w:val="single" w:sz="6" w:space="0" w:color="auto"/>
+              <w:right w:val="single" w:sz="6" w:space="0" w:color="auto"/>
+            </w:tcBorders>
+            <w:vAlign w:val="center"/>
+            <w:hideMark/>
+          </w:tcPr>
+          <w:p/>
+        </w:tc>
+        <w:tc>
+          <w:tcPr>
+            <w:tcW w:w="0" w:type="auto"/>
+            <w:tcBorders>
+              <w:top w:val="single" w:sz="6" w:space="0" w:color="auto"/>
+              <w:left w:val="single" w:sz="6" w:space="0" w:color="auto"/>
+              <w:bottom w:val="single" w:sz="6" w:space="0" w:color="auto"/>
+              <w:right w:val="single" w:sz="6" w:space="0" w:color="auto"/>
+            </w:tcBorders>
+            <w:vAlign w:val="center"/>
+            <w:hideMark/>
+          </w:tcPr>
+          <w:p>
+            <w:r>
+              <w:rPr>
+                <w:b/>
+                <w:bCs/>
+              </w:rPr>
+              <w:t>FO-LC-28</w:t>
+            </w:r>
+          </w:p>
+        </w:tc>
+        <w:tc>
+          <w:tcPr>
+            <w:tcW w:w="0" w:type="auto"/>
+            <w:tcBorders>
+              <w:top w:val="single" w:sz="6" w:space="0" w:color="auto"/>
+              <w:left w:val="single" w:sz="6" w:space="0" w:color="auto"/>
+              <w:bottom w:val="single" w:sz="6" w:space="0" w:color="auto"/>
+              <w:right w:val="single" w:sz="6" w:space="0" w:color="auto"/>
+            </w:tcBorders>
+            <w:vAlign w:val="center"/>
+            <w:hideMark/>
+          </w:tcPr>
+          <w:p>
+            <w:r>
+              <w:t>Uso Equipos</w:t>
+            </w:r>
+          </w:p>
+        </w:tc>
+        <w:tc>
+          <w:tcPr>
+            <w:tcW w:w="0" w:type="auto"/>
+            <w:tcBorders>
+              <w:top w:val="single" w:sz="6" w:space="0" w:color="auto"/>
+              <w:left w:val="single" w:sz="6" w:space="0" w:color="auto"/>
+              <w:bottom w:val="single" w:sz="6" w:space="0" w:color="auto"/>
+              <w:right w:val="single" w:sz="6" w:space="0" w:color="auto"/>
+            </w:tcBorders>
+            <w:vAlign w:val="center"/>
+            <w:hideMark/>
+          </w:tcPr>
+          <w:p>
+            <w:r>
+              <w:t>IT-MAN-02 (Limpieza y Uso)</w:t>
+            </w:r>
+          </w:p>
+        </w:tc>
+        <w:tc>
+          <w:tcPr>
+            <w:tcW w:w="0" w:type="auto"/>
+            <w:tcBorders>
+              <w:top w:val="single" w:sz="6" w:space="0" w:color="auto"/>
+              <w:left w:val="single" w:sz="6" w:space="0" w:color="auto"/>
+              <w:bottom w:val="single" w:sz="6" w:space="0" w:color="auto"/>
+              <w:right w:val="single" w:sz="6" w:space="0" w:color="auto"/>
+            </w:tcBorders>
+            <w:vAlign w:val="center"/>
+            <w:hideMark/>
+          </w:tcPr>
+          <w:p>
+            <w:r>
+              <w:rPr>
+                <w:b/>
+                <w:bCs/>
+              </w:rPr>
+              <w:t>Trazabilidad:</w:t>
+            </w:r>
+            <w:r>
+              <w:t xml:space="preserve"> Registro diario de quién usó qué equipo y para qué lote.</w:t>
+            </w:r>
+          </w:p>
+        </w:tc>
+      </w:tr>
+      <w:tr>
+        <w:trPr>
+          <w:tblCellSpacing w:w="15" w:type="dxa"/>
+        </w:trPr>
+        <w:tc>
+          <w:tcPr>
+            <w:tcW w:w="0" w:type="auto"/>
+            <w:tcBorders>
+              <w:top w:val="single" w:sz="6" w:space="0" w:color="auto"/>
+              <w:left w:val="single" w:sz="6" w:space="0" w:color="auto"/>
+              <w:bottom w:val="single" w:sz="6" w:space="0" w:color="auto"/>
+              <w:right w:val="single" w:sz="6" w:space="0" w:color="auto"/>
+            </w:tcBorders>
+            <w:vAlign w:val="center"/>
+            <w:hideMark/>
+          </w:tcPr>
+          <w:p>
+            <w:r>
+              <w:rPr>
+                <w:b/>
+                <w:bCs/>
+              </w:rPr>
+              <w:t>8. CALIDAD</w:t>
+            </w:r>
+          </w:p>
+        </w:tc>
+        <w:tc>
+          <w:tcPr>
+            <w:tcW w:w="0" w:type="auto"/>
+            <w:tcBorders>
+              <w:top w:val="single" w:sz="6" w:space="0" w:color="auto"/>
+              <w:left w:val="single" w:sz="6" w:space="0" w:color="auto"/>
+              <w:bottom w:val="single" w:sz="6" w:space="0" w:color="auto"/>
+              <w:right w:val="single" w:sz="6" w:space="0" w:color="auto"/>
+            </w:tcBorders>
+            <w:vAlign w:val="center"/>
+            <w:hideMark/>
+          </w:tcPr>
+          <w:p>
+            <w:r>
+              <w:rPr>
+                <w:b/>
+                <w:bCs/>
+              </w:rPr>
+              <w:t>FO-LC-41</w:t>
+            </w:r>
+          </w:p>
+        </w:tc>
+        <w:tc>
+          <w:tcPr>
+            <w:tcW w:w="0" w:type="auto"/>
+            <w:tcBorders>
+              <w:top w:val="single" w:sz="6" w:space="0" w:color="auto"/>
+              <w:left w:val="single" w:sz="6" w:space="0" w:color="auto"/>
+              <w:bottom w:val="single" w:sz="6" w:space="0" w:color="auto"/>
+              <w:right w:val="single" w:sz="6" w:space="0" w:color="auto"/>
+            </w:tcBorders>
+            <w:vAlign w:val="center"/>
+            <w:hideMark/>
+          </w:tcPr>
+          <w:p>
+            <w:r>
+              <w:t>Control Micro</w:t>
+            </w:r>
+          </w:p>
+        </w:tc>
+        <w:tc>
+          <w:tcPr>
+            <w:tcW w:w="0" w:type="auto"/>
+            <w:tcBorders>
+              <w:top w:val="single" w:sz="6" w:space="0" w:color="auto"/>
+              <w:left w:val="single" w:sz="6" w:space="0" w:color="auto"/>
+              <w:bottom w:val="single" w:sz="6" w:space="0" w:color="auto"/>
+              <w:right w:val="single" w:sz="6" w:space="0" w:color="auto"/>
+            </w:tcBorders>
+            <w:vAlign w:val="center"/>
+            <w:hideMark/>
+          </w:tcPr>
+          <w:p>
+            <w:r>
+              <w:t>PR-CAL-04 (Microbiología)</w:t>
+            </w:r>
+          </w:p>
+        </w:tc>
+        <w:tc>
+          <w:tcPr>
+            <w:tcW w:w="0" w:type="auto"/>
+            <w:tcBorders>
+              <w:top w:val="single" w:sz="6" w:space="0" w:color="auto"/>
+              <w:left w:val="single" w:sz="6" w:space="0" w:color="auto"/>
+              <w:bottom w:val="single" w:sz="6" w:space="0" w:color="auto"/>
+              <w:right w:val="single" w:sz="6" w:space="0" w:color="auto"/>
+            </w:tcBorders>
+            <w:vAlign w:val="center"/>
+            <w:hideMark/>
+          </w:tcPr>
+          <w:p>
+            <w:r>
+              <w:rPr>
+                <w:b/>
+                <w:bCs/>
+              </w:rPr>
+              <w:t>Analítica:</w:t>
+            </w:r>
+            <w:r>
+              <w:t xml:space="preserve"> Registro de resultados de cultivos (Aerobios/Anaerobios/Hongos).</w:t>
+            </w:r>
+          </w:p>
+        </w:tc>
+      </w:tr>
+      <w:tr>
+        <w:trPr>
+          <w:tblCellSpacing w:w="15" w:type="dxa"/>
+        </w:trPr>
+        <w:tc>
+          <w:tcPr>
+            <w:tcW w:w="0" w:type="auto"/>
+            <w:tcBorders>
+              <w:top w:val="single" w:sz="6" w:space="0" w:color="auto"/>
+              <w:left w:val="single" w:sz="6" w:space="0" w:color="auto"/>
+              <w:bottom w:val="single" w:sz="6" w:space="0" w:color="auto"/>
+              <w:right w:val="single" w:sz="6" w:space="0" w:color="auto"/>
+            </w:tcBorders>
+            <w:vAlign w:val="center"/>
+            <w:hideMark/>
+          </w:tcPr>
+          <w:p/>
+        </w:tc>
+        <w:tc>
+          <w:tcPr>
+            <w:tcW w:w="0" w:type="auto"/>
+            <w:tcBorders>
+              <w:top w:val="single" w:sz="6" w:space="0" w:color="auto"/>
+              <w:left w:val="single" w:sz="6" w:space="0" w:color="auto"/>
+              <w:bottom w:val="single" w:sz="6" w:space="0" w:color="auto"/>
+              <w:right w:val="single" w:sz="6" w:space="0" w:color="auto"/>
+            </w:tcBorders>
+            <w:vAlign w:val="center"/>
+            <w:hideMark/>
+          </w:tcPr>
+          <w:p>
+            <w:r>
+              <w:rPr>
+                <w:b/>
+                <w:bCs/>
+              </w:rPr>
+              <w:t>FO-LC-44</w:t>
+            </w:r>
+          </w:p>
+        </w:tc>
+        <w:tc>
+          <w:tcPr>
+            <w:tcW w:w="0" w:type="auto"/>
+            <w:tcBorders>
+              <w:top w:val="single" w:sz="6" w:space="0" w:color="auto"/>
+              <w:left w:val="single" w:sz="6" w:space="0" w:color="auto"/>
+              <w:bottom w:val="single" w:sz="6" w:space="0" w:color="auto"/>
+              <w:right w:val="single" w:sz="6" w:space="0" w:color="auto"/>
+            </w:tcBorders>
+            <w:vAlign w:val="center"/>
+            <w:hideMark/>
+          </w:tcPr>
+          <w:p>
+            <w:r>
+              <w:t>Liberación Flasks</w:t>
+            </w:r>
+          </w:p>
+        </w:tc>
+        <w:tc>
+          <w:tcPr>
+            <w:tcW w:w="0" w:type="auto"/>
+            <w:tcBorders>
+              <w:top w:val="single" w:sz="6" w:space="0" w:color="auto"/>
+              <w:left w:val="single" w:sz="6" w:space="0" w:color="auto"/>
+              <w:bottom w:val="single" w:sz="6" w:space="0" w:color="auto"/>
+              <w:right w:val="single" w:sz="6" w:space="0" w:color="auto"/>
+            </w:tcBorders>
+            <w:vAlign w:val="center"/>
+            <w:hideMark/>
+          </w:tcPr>
+          <w:p>
+            <w:r>
+              <w:t>IT-CAL-05 (Lib. Intermedia)</w:t>
+            </w:r>
+          </w:p>
+        </w:tc>
+        <w:tc>
+          <w:tcPr>
+            <w:tcW w:w="0" w:type="auto"/>
+            <w:tcBorders>
+              <w:top w:val="single" w:sz="6" w:space="0" w:color="auto"/>
+              <w:left w:val="single" w:sz="6" w:space="0" w:color="auto"/>
+              <w:bottom w:val="single" w:sz="6" w:space="0" w:color="auto"/>
+              <w:right w:val="single" w:sz="6" w:space="0" w:color="auto"/>
+            </w:tcBorders>
+            <w:vAlign w:val="center"/>
+            <w:hideMark/>
+          </w:tcPr>
+          <w:p>
+            <w:r>
+              <w:rPr>
+                <w:b/>
+                <w:bCs/>
+              </w:rPr>
+              <w:t>Dictamen:</w:t>
+            </w:r>
+            <w:r>
+              <w:t xml:space="preserve"> Calidad libera o rechaza etapas intermedias (Flasks/Viales) para continuar.</w:t>
+            </w:r>
+          </w:p>
+        </w:tc>
+      </w:tr>
+      <w:tr>
+        <w:trPr>
+          <w:tblCellSpacing w:w="15" w:type="dxa"/>
+        </w:trPr>
+        <w:tc>
+          <w:tcPr>
+            <w:tcW w:w="0" w:type="auto"/>
+            <w:tcBorders>
+              <w:top w:val="single" w:sz="6" w:space="0" w:color="auto"/>
+              <w:left w:val="single" w:sz="6" w:space="0" w:color="auto"/>
+              <w:bottom w:val="single" w:sz="6" w:space="0" w:color="auto"/>
+              <w:right w:val="single" w:sz="6" w:space="0" w:color="auto"/>
+            </w:tcBorders>
+            <w:vAlign w:val="center"/>
+            <w:hideMark/>
+          </w:tcPr>
+          <w:p/>
+        </w:tc>
+        <w:tc>
+          <w:tcPr>
+            <w:tcW w:w="0" w:type="auto"/>
+            <w:tcBorders>
+              <w:top w:val="single" w:sz="6" w:space="0" w:color="auto"/>
+              <w:left w:val="single" w:sz="6" w:space="0" w:color="auto"/>
+              <w:bottom w:val="single" w:sz="6" w:space="0" w:color="auto"/>
+              <w:right w:val="single" w:sz="6" w:space="0" w:color="auto"/>
+            </w:tcBorders>
+            <w:vAlign w:val="center"/>
+            <w:hideMark/>
+          </w:tcPr>
+          <w:p>
+            <w:r>
+              <w:rPr>
+                <w:b/>
+                <w:bCs/>
+              </w:rPr>
+              <w:t>FO-LC-32</w:t>
+            </w:r>
+          </w:p>
+        </w:tc>
+        <w:tc>
+          <w:tcPr>
+            <w:tcW w:w="0" w:type="auto"/>
+            <w:tcBorders>
+              <w:top w:val="single" w:sz="6" w:space="0" w:color="auto"/>
+              <w:left w:val="single" w:sz="6" w:space="0" w:color="auto"/>
+              <w:bottom w:val="single" w:sz="6" w:space="0" w:color="auto"/>
+              <w:right w:val="single" w:sz="6" w:space="0" w:color="auto"/>
+            </w:tcBorders>
+            <w:vAlign w:val="center"/>
+            <w:hideMark/>
+          </w:tcPr>
+          <w:p>
+            <w:r>
+              <w:t>Liberación Lote</w:t>
+            </w:r>
+          </w:p>
+        </w:tc>
+        <w:tc>
+          <w:tcPr>
+            <w:tcW w:w="0" w:type="auto"/>
+            <w:tcBorders>
+              <w:top w:val="single" w:sz="6" w:space="0" w:color="auto"/>
+              <w:left w:val="single" w:sz="6" w:space="0" w:color="auto"/>
+              <w:bottom w:val="single" w:sz="6" w:space="0" w:color="auto"/>
+              <w:right w:val="single" w:sz="6" w:space="0" w:color="auto"/>
+            </w:tcBorders>
+            <w:vAlign w:val="center"/>
+            <w:hideMark/>
+          </w:tcPr>
+          <w:p>
+            <w:r>
+              <w:t>PR-CAL-06 (Lib. Producto Final)</w:t>
+            </w:r>
+          </w:p>
+        </w:tc>
+        <w:tc>
+          <w:tcPr>
+            <w:tcW w:w="0" w:type="auto"/>
+            <w:tcBorders>
+              <w:top w:val="single" w:sz="6" w:space="0" w:color="auto"/>
+              <w:left w:val="single" w:sz="6" w:space="0" w:color="auto"/>
+              <w:bottom w:val="single" w:sz="6" w:space="0" w:color="auto"/>
+              <w:right w:val="single" w:sz="6" w:space="0" w:color="auto"/>
+            </w:tcBorders>
+            <w:vAlign w:val="center"/>
+            <w:hideMark/>
+          </w:tcPr>
+          <w:p>
+            <w:r>
+              <w:rPr>
+                <w:b/>
+                <w:bCs/>
+              </w:rPr>
+              <w:t>Certificado:</w:t>
+            </w:r>
+            <w:r>
+              <w:t xml:space="preserve"> Documento final donde QA aprueba la venta del lote (COA interno).</w:t>
+            </w:r>
+          </w:p>
+        </w:tc>
+      </w:tr>
+      <w:tr>
+        <w:trPr>
+          <w:tblCellSpacing w:w="15" w:type="dxa"/>
+        </w:trPr>
+        <w:tc>
+          <w:tcPr>
+            <w:tcW w:w="0" w:type="auto"/>
+            <w:tcBorders>
+              <w:top w:val="single" w:sz="6" w:space="0" w:color="auto"/>
+              <w:left w:val="single" w:sz="6" w:space="0" w:color="auto"/>
+              <w:bottom w:val="single" w:sz="6" w:space="0" w:color="auto"/>
+              <w:right w:val="single" w:sz="6" w:space="0" w:color="auto"/>
+            </w:tcBorders>
+            <w:vAlign w:val="center"/>
+            <w:hideMark/>
+          </w:tcPr>
+          <w:p/>
+        </w:tc>
+        <w:tc>
+          <w:tcPr>
+            <w:tcW w:w="0" w:type="auto"/>
+            <w:tcBorders>
+              <w:top w:val="single" w:sz="6" w:space="0" w:color="auto"/>
+              <w:left w:val="single" w:sz="6" w:space="0" w:color="auto"/>
+              <w:bottom w:val="single" w:sz="6" w:space="0" w:color="auto"/>
+              <w:right w:val="single" w:sz="6" w:space="0" w:color="auto"/>
+            </w:tcBorders>
+            <w:vAlign w:val="center"/>
+            <w:hideMark/>
+          </w:tcPr>
+          <w:p>
+            <w:r>
+              <w:rPr>
+                <w:b/>
+                <w:bCs/>
+              </w:rPr>
+              <w:t>FO-LC-45</w:t>
+            </w:r>
+          </w:p>
+        </w:tc>
+        <w:tc>
+          <w:tcPr>
+            <w:tcW w:w="0" w:type="auto"/>
+            <w:tcBorders>
+              <w:top w:val="single" w:sz="6" w:space="0" w:color="auto"/>
+              <w:left w:val="single" w:sz="6" w:space="0" w:color="auto"/>
+              <w:bottom w:val="single" w:sz="6" w:space="0" w:color="auto"/>
+              <w:right w:val="single" w:sz="6" w:space="0" w:color="auto"/>
+            </w:tcBorders>
+            <w:vAlign w:val="center"/>
+            <w:hideMark/>
+          </w:tcPr>
+          <w:p>
+            <w:r>
+              <w:t>Embalaje</w:t>
+            </w:r>
+          </w:p>
+        </w:tc>
+        <w:tc>
+          <w:tcPr>
+            <w:tcW w:w="0" w:type="auto"/>
+            <w:tcBorders>
+              <w:top w:val="single" w:sz="6" w:space="0" w:color="auto"/>
+              <w:left w:val="single" w:sz="6" w:space="0" w:color="auto"/>
+              <w:bottom w:val="single" w:sz="6" w:space="0" w:color="auto"/>
+              <w:right w:val="single" w:sz="6" w:space="0" w:color="auto"/>
+            </w:tcBorders>
+            <w:vAlign w:val="center"/>
+            <w:hideMark/>
+          </w:tcPr>
+          <w:p>
+            <w:r>
+              <w:t>IT-LOG-03 (Envío Esterilización)</w:t>
+            </w:r>
+          </w:p>
+        </w:tc>
+        <w:tc>
+          <w:tcPr>
+            <w:tcW w:w="0" w:type="auto"/>
+            <w:tcBorders>
+              <w:top w:val="single" w:sz="6" w:space="0" w:color="auto"/>
+              <w:left w:val="single" w:sz="6" w:space="0" w:color="auto"/>
+              <w:bottom w:val="single" w:sz="6" w:space="0" w:color="auto"/>
+              <w:right w:val="single" w:sz="6" w:space="0" w:color="auto"/>
+            </w:tcBorders>
+            <w:vAlign w:val="center"/>
+            <w:hideMark/>
+          </w:tcPr>
+          <w:p>
+            <w:r>
+              <w:rPr>
+                <w:b/>
+                <w:bCs/>
+              </w:rPr>
+              <w:t>Externo:</w:t>
+            </w:r>
+            <w:r>
+              <w:t xml:space="preserve"> Control de envío y recepción de material a irradiación externa.</w:t>
+            </w:r>
+          </w:p>
+        </w:tc>
+      </w:tr>
+      <w:tr>
+        <w:trPr>
+          <w:tblCellSpacing w:w="15" w:type="dxa"/>
+        </w:trPr>
+        <w:tc>
+          <w:tcPr>
+            <w:tcW w:w="0" w:type="auto"/>
+            <w:tcBorders>
+              <w:top w:val="single" w:sz="6" w:space="0" w:color="auto"/>
+              <w:left w:val="single" w:sz="6" w:space="0" w:color="auto"/>
+              <w:bottom w:val="single" w:sz="6" w:space="0" w:color="auto"/>
+              <w:right w:val="single" w:sz="6" w:space="0" w:color="auto"/>
+            </w:tcBorders>
+            <w:vAlign w:val="center"/>
+            <w:hideMark/>
+          </w:tcPr>
+          <w:p>
+            <w:r>
+              <w:rPr>
+                <w:b/>
+                <w:bCs/>
+              </w:rPr>
+              <w:t>9. SALIDA</w:t>
+            </w:r>
+          </w:p>
+        </w:tc>
+        <w:tc>
+          <w:tcPr>
+            <w:tcW w:w="0" w:type="auto"/>
+            <w:tcBorders>
+              <w:top w:val="single" w:sz="6" w:space="0" w:color="auto"/>
+              <w:left w:val="single" w:sz="6" w:space="0" w:color="auto"/>
+              <w:bottom w:val="single" w:sz="6" w:space="0" w:color="auto"/>
+              <w:right w:val="single" w:sz="6" w:space="0" w:color="auto"/>
+            </w:tcBorders>
+            <w:vAlign w:val="center"/>
+            <w:hideMark/>
+          </w:tcPr>
+          <w:p>
+            <w:r>
+              <w:rPr>
+                <w:b/>
+                <w:bCs/>
+              </w:rPr>
+              <w:t>FO-OP-20</w:t>
+            </w:r>
+          </w:p>
+        </w:tc>
+        <w:tc>
+          <w:tcPr>
+            <w:tcW w:w="0" w:type="auto"/>
+            <w:tcBorders>
+              <w:top w:val="single" w:sz="6" w:space="0" w:color="auto"/>
+              <w:left w:val="single" w:sz="6" w:space="0" w:color="auto"/>
+              <w:bottom w:val="single" w:sz="6" w:space="0" w:color="auto"/>
+              <w:right w:val="single" w:sz="6" w:space="0" w:color="auto"/>
+            </w:tcBorders>
+            <w:vAlign w:val="center"/>
+            <w:hideMark/>
+          </w:tcPr>
+          <w:p>
+            <w:r>
+              <w:t>Liberación Almacén</w:t>
+            </w:r>
+          </w:p>
+        </w:tc>
+        <w:tc>
+          <w:tcPr>
+            <w:tcW w:w="0" w:type="auto"/>
+            <w:tcBorders>
+              <w:top w:val="single" w:sz="6" w:space="0" w:color="auto"/>
+              <w:left w:val="single" w:sz="6" w:space="0" w:color="auto"/>
+              <w:bottom w:val="single" w:sz="6" w:space="0" w:color="auto"/>
+              <w:right w:val="single" w:sz="6" w:space="0" w:color="auto"/>
+            </w:tcBorders>
+            <w:vAlign w:val="center"/>
+            <w:hideMark/>
+          </w:tcPr>
+          <w:p>
+            <w:r>
+              <w:t>PR-LOG-04 (Salida Almacén)</w:t>
+            </w:r>
+          </w:p>
+        </w:tc>
+        <w:tc>
+          <w:tcPr>
+            <w:tcW w:w="0" w:type="auto"/>
+            <w:tcBorders>
+              <w:top w:val="single" w:sz="6" w:space="0" w:color="auto"/>
+              <w:left w:val="single" w:sz="6" w:space="0" w:color="auto"/>
+              <w:bottom w:val="single" w:sz="6" w:space="0" w:color="auto"/>
+              <w:right w:val="single" w:sz="6" w:space="0" w:color="auto"/>
+            </w:tcBorders>
+            <w:vAlign w:val="center"/>
+            <w:hideMark/>
+          </w:tcPr>
+          <w:p>
+            <w:r>
+              <w:rPr>
+                <w:b/>
+                <w:bCs/>
+              </w:rPr>
+              <w:t>Baja:</w:t>
+            </w:r>
+            <w:r>
+              <w:t xml:space="preserve"> Descuento definitivo del inventario físico y transferencia a logística.</w:t>
+            </w:r>
+          </w:p>
+        </w:tc>
+      </w:tr>
+      <w:tr>
+        <w:trPr>
+          <w:tblCellSpacing w:w="15" w:type="dxa"/>
+        </w:trPr>
+        <w:tc>
+          <w:tcPr>
+            <w:tcW w:w="0" w:type="auto"/>
+            <w:tcBorders>
+              <w:top w:val="single" w:sz="6" w:space="0" w:color="auto"/>
+              <w:left w:val="single" w:sz="6" w:space="0" w:color="auto"/>
+              <w:bottom w:val="single" w:sz="6" w:space="0" w:color="auto"/>
+              <w:right w:val="single" w:sz="6" w:space="0" w:color="auto"/>
+            </w:tcBorders>
+            <w:vAlign w:val="center"/>
+            <w:hideMark/>
+          </w:tcPr>
+          <w:p/>
+        </w:tc>
+        <w:tc>
+          <w:tcPr>
+            <w:tcW w:w="0" w:type="auto"/>
+            <w:tcBorders>
+              <w:top w:val="single" w:sz="6" w:space="0" w:color="auto"/>
+              <w:left w:val="single" w:sz="6" w:space="0" w:color="auto"/>
+              <w:bottom w:val="single" w:sz="6" w:space="0" w:color="auto"/>
+              <w:right w:val="single" w:sz="6" w:space="0" w:color="auto"/>
+            </w:tcBorders>
+            <w:vAlign w:val="center"/>
+            <w:hideMark/>
+          </w:tcPr>
+          <w:p>
+            <w:r>
+              <w:rPr>
+                <w:b/>
+                <w:bCs/>
+              </w:rPr>
+              <w:t>FO-OP-17</w:t>
+            </w:r>
+          </w:p>
+        </w:tc>
+        <w:tc>
+          <w:tcPr>
+            <w:tcW w:w="0" w:type="auto"/>
+            <w:tcBorders>
+              <w:top w:val="single" w:sz="6" w:space="0" w:color="auto"/>
+              <w:left w:val="single" w:sz="6" w:space="0" w:color="auto"/>
+              <w:bottom w:val="single" w:sz="6" w:space="0" w:color="auto"/>
+              <w:right w:val="single" w:sz="6" w:space="0" w:color="auto"/>
+            </w:tcBorders>
+            <w:vAlign w:val="center"/>
+            <w:hideMark/>
+          </w:tcPr>
+          <w:p>
+            <w:r>
+              <w:t>Nota de Remisión</w:t>
+            </w:r>
+          </w:p>
+        </w:tc>
+        <w:tc>
+          <w:tcPr>
+            <w:tcW w:w="0" w:type="auto"/>
+            <w:tcBorders>
+              <w:top w:val="single" w:sz="6" w:space="0" w:color="auto"/>
+              <w:left w:val="single" w:sz="6" w:space="0" w:color="auto"/>
+              <w:bottom w:val="single" w:sz="6" w:space="0" w:color="auto"/>
+              <w:right w:val="single" w:sz="6" w:space="0" w:color="auto"/>
+            </w:tcBorders>
+            <w:vAlign w:val="center"/>
+            <w:hideMark/>
+          </w:tcPr>
+          <w:p>
+            <w:r>
+              <w:t>PR-COM-02 (Entrega Cliente)</w:t>
+            </w:r>
+          </w:p>
+        </w:tc>
+        <w:tc>
+          <w:tcPr>
+            <w:tcW w:w="0" w:type="auto"/>
+            <w:tcBorders>
+              <w:top w:val="single" w:sz="6" w:space="0" w:color="auto"/>
+              <w:left w:val="single" w:sz="6" w:space="0" w:color="auto"/>
+              <w:bottom w:val="single" w:sz="6" w:space="0" w:color="auto"/>
+              <w:right w:val="single" w:sz="6" w:space="0" w:color="auto"/>
+            </w:tcBorders>
+            <w:vAlign w:val="center"/>
+            <w:hideMark/>
+          </w:tcPr>
+          <w:p>
+            <w:r>
+              <w:rPr>
+                <w:b/>
+                <w:bCs/>
+              </w:rPr>
+              <w:t>Legal:</w:t>
+            </w:r>
+            <w:r>
+              <w:t xml:space="preserve"> Documento fiscal/legal de entrega al cliente con acuse de recibo y conformidad.</w:t>
+            </w:r>
+          </w:p>
+        </w:tc>
+      </w:tr>
+    </w:tbl>
     <w:p/>
-    <w:p/>
-    <w:p/>
-    <w:p/>
-    <w:p>
-      <w:r>
-        <w:br/>
-      </w:r>
-      <w:r>
-        <w:br/>
-      </w:r>
-      <w:r>
-        <w:br/>
-      </w:r>
-      <w:r>
-        <w:br/>
-      </w:r>
-    </w:p>
     <w:sectPr>
       <w:pgSz w:w="12240" w:h="15840"/>
       <w:pgMar w:top="1417" w:right="1701" w:bottom="1417" w:left="1701" w:header="708" w:footer="708" w:gutter="0"/>
@@ -2103,7 +6521,6 @@
   <w:style w:type="character" w:default="1" w:styleId="Fuentedeprrafopredeter">
     <w:name w:val="Default Paragraph Font"/>
     <w:uiPriority w:val="1"/>
-    <w:semiHidden/>
     <w:unhideWhenUsed/>
   </w:style>
   <w:style w:type="table" w:default="1" w:styleId="Tablanormal">

</xml_diff>